<commit_message>
Update resume: add profile photo, left date column, spacing between roles
- Added the profile photo from the original document into the header,
  alongside the name, title, and contact details.
- Moved all dates (work experience, education, certifications) to a
  left-hand timeline column.
- Increased vertical spacing between work-experience entries.

Co-Authored-By: Claude Opus 4.8 <noreply@anthropic.com>
Claude-Session: https://claude.ai/code/session_013RC3wQNy7JaaAvDs11Bx7s
</commit_message>
<xml_diff>
--- a/Makhahlela_Shiburi_Resume.docx
+++ b/Makhahlela_Shiburi_Resume.docx
@@ -2,45 +2,147 @@
 <file path=word/document.xml><?xml version="1.0" encoding="utf-8"?>
 <w:document xmlns:wpc="http://schemas.microsoft.com/office/word/2010/wordprocessingCanvas" xmlns:mo="http://schemas.microsoft.com/office/mac/office/2008/main" xmlns:mc="http://schemas.openxmlformats.org/markup-compatibility/2006" xmlns:mv="urn:schemas-microsoft-com:mac:vml" xmlns:o="urn:schemas-microsoft-com:office:office" xmlns:r="http://schemas.openxmlformats.org/officeDocument/2006/relationships" xmlns:m="http://schemas.openxmlformats.org/officeDocument/2006/math" xmlns:v="urn:schemas-microsoft-com:vml" xmlns:wp14="http://schemas.microsoft.com/office/word/2010/wordprocessingDrawing" xmlns:wp="http://schemas.openxmlformats.org/drawingml/2006/wordprocessingDrawing" xmlns:w10="urn:schemas-microsoft-com:office:word" xmlns:w="http://schemas.openxmlformats.org/wordprocessingml/2006/main" xmlns:w14="http://schemas.microsoft.com/office/word/2010/wordml" xmlns:wpg="http://schemas.microsoft.com/office/word/2010/wordprocessingGroup" xmlns:wpi="http://schemas.microsoft.com/office/word/2010/wordprocessingInk" xmlns:wne="http://schemas.microsoft.com/office/word/2006/wordml" xmlns:wps="http://schemas.microsoft.com/office/word/2010/wordprocessingShape" mc:Ignorable="w14 wp14">
   <w:body>
+    <w:tbl>
+      <w:tblPr>
+        <w:tblW w:type="auto" w:w="0"/>
+        <w:tblLook w:firstColumn="1" w:firstRow="1" w:lastColumn="0" w:lastRow="0" w:noHBand="0" w:noVBand="1" w:val="04A0"/>
+        <w:tblBorders>
+          <w:top w:val="none" w:sz="0" w:space="0"/>
+          <w:left w:val="none" w:sz="0" w:space="0"/>
+          <w:bottom w:val="none" w:sz="0" w:space="0"/>
+          <w:right w:val="none" w:sz="0" w:space="0"/>
+          <w:insideH w:val="none" w:sz="0" w:space="0"/>
+          <w:insideV w:val="none" w:sz="0" w:space="0"/>
+        </w:tblBorders>
+        <w:tblLayout w:type="fixed"/>
+      </w:tblPr>
+      <w:tblGrid>
+        <w:gridCol w:w="5256"/>
+        <w:gridCol w:w="5256"/>
+      </w:tblGrid>
+      <w:tr>
+        <w:tc>
+          <w:tcPr>
+            <w:tcW w:type="dxa" w:w="1655"/>
+            <w:tcMar>
+              <w:top w:w="0" w:type="dxa"/>
+              <w:left w:w="0" w:type="dxa"/>
+              <w:bottom w:w="0" w:type="dxa"/>
+              <w:right w:w="140" w:type="dxa"/>
+            </w:tcMar>
+            <w:vAlign w:val="center"/>
+          </w:tcPr>
+          <w:p>
+            <w:pPr>
+              <w:spacing w:after="0"/>
+            </w:pPr>
+            <w:r>
+              <w:drawing>
+                <wp:inline xmlns:a="http://schemas.openxmlformats.org/drawingml/2006/main" xmlns:pic="http://schemas.openxmlformats.org/drawingml/2006/picture">
+                  <wp:extent cx="914400" cy="1638678"/>
+                  <wp:docPr id="1" name="Picture 1"/>
+                  <wp:cNvGraphicFramePr>
+                    <a:graphicFrameLocks noChangeAspect="1"/>
+                  </wp:cNvGraphicFramePr>
+                  <a:graphic>
+                    <a:graphicData uri="http://schemas.openxmlformats.org/drawingml/2006/picture">
+                      <pic:pic>
+                        <pic:nvPicPr>
+                          <pic:cNvPr id="0" name="profile.png"/>
+                          <pic:cNvPicPr/>
+                        </pic:nvPicPr>
+                        <pic:blipFill>
+                          <a:blip r:embed="rId9"/>
+                          <a:stretch>
+                            <a:fillRect/>
+                          </a:stretch>
+                        </pic:blipFill>
+                        <pic:spPr>
+                          <a:xfrm>
+                            <a:off x="0" y="0"/>
+                            <a:ext cx="914400" cy="1638678"/>
+                          </a:xfrm>
+                          <a:prstGeom prst="rect"/>
+                        </pic:spPr>
+                      </pic:pic>
+                    </a:graphicData>
+                  </a:graphic>
+                </wp:inline>
+              </w:drawing>
+            </w:r>
+          </w:p>
+        </w:tc>
+        <w:tc>
+          <w:tcPr>
+            <w:tcW w:type="dxa" w:w="8856"/>
+            <w:tcMar>
+              <w:top w:w="0" w:type="dxa"/>
+              <w:left w:w="0" w:type="dxa"/>
+              <w:bottom w:w="0" w:type="dxa"/>
+              <w:right w:w="0" w:type="dxa"/>
+            </w:tcMar>
+            <w:vAlign w:val="center"/>
+          </w:tcPr>
+          <w:p>
+            <w:pPr>
+              <w:spacing w:after="0"/>
+            </w:pPr>
+            <w:r>
+              <w:rPr>
+                <w:rFonts w:ascii="Calibri" w:hAnsi="Calibri"/>
+                <w:b/>
+                <w:i w:val="0"/>
+                <w:sz w:val="46"/>
+              </w:rPr>
+              <w:t>Makhahlela Shiburi</w:t>
+            </w:r>
+          </w:p>
+          <w:p>
+            <w:pPr>
+              <w:spacing w:after="0"/>
+            </w:pPr>
+            <w:r>
+              <w:rPr>
+                <w:rFonts w:ascii="Calibri" w:hAnsi="Calibri"/>
+                <w:b w:val="0"/>
+                <w:i w:val="0"/>
+                <w:color w:val="333333"/>
+                <w:sz w:val="23"/>
+              </w:rPr>
+              <w:t>IT Support Technician</w:t>
+            </w:r>
+          </w:p>
+          <w:p>
+            <w:pPr>
+              <w:spacing w:before="40"/>
+            </w:pPr>
+            <w:r>
+              <w:rPr>
+                <w:rFonts w:ascii="Calibri" w:hAnsi="Calibri"/>
+                <w:b w:val="0"/>
+                <w:i w:val="0"/>
+                <w:sz w:val="21"/>
+              </w:rPr>
+              <w:t>Pretoria, 0183   |   082 256 9903   |   shiburi4278@gmail.com</w:t>
+            </w:r>
+          </w:p>
+        </w:tc>
+      </w:tr>
+    </w:tbl>
     <w:p>
       <w:pPr>
-        <w:spacing w:after="0"/>
-        <w:jc w:val="center"/>
+        <w:pBdr>
+          <w:bottom w:val="single" w:sz="12" w:space="1" w:color="000000"/>
+        </w:pBdr>
+        <w:spacing w:before="40" w:after="0"/>
       </w:pPr>
-      <w:r>
-        <w:rPr>
-          <w:rFonts w:ascii="Calibri" w:hAnsi="Calibri"/>
-          <w:b/>
-          <w:i w:val="0"/>
-          <w:sz w:val="44"/>
-        </w:rPr>
-        <w:t>Makhahlela Shiburi</w:t>
-      </w:r>
     </w:p>
     <w:p>
       <w:pPr>
-        <w:spacing w:after="40"/>
-        <w:jc w:val="center"/>
         <w:pBdr>
           <w:bottom w:val="single" w:sz="6" w:space="1" w:color="000000"/>
         </w:pBdr>
-      </w:pPr>
-      <w:r>
-        <w:rPr>
-          <w:rFonts w:ascii="Calibri" w:hAnsi="Calibri"/>
-          <w:b w:val="0"/>
-          <w:i w:val="0"/>
-          <w:sz w:val="21"/>
-        </w:rPr>
-        <w:t>Pretoria, 0183  |  082 256 9903  |  shiburi4278@gmail.com</w:t>
-      </w:r>
-    </w:p>
-    <w:p>
-      <w:pPr>
-        <w:spacing w:before="120" w:after="40"/>
-        <w:pBdr>
-          <w:bottom w:val="single" w:sz="6" w:space="1" w:color="000000"/>
-        </w:pBdr>
+        <w:spacing w:before="160" w:after="60"/>
       </w:pPr>
       <w:r>
         <w:rPr>
@@ -55,6 +157,7 @@
     <w:p>
       <w:pPr>
         <w:spacing w:before="40"/>
+        <w:jc w:val="both"/>
       </w:pPr>
       <w:r>
         <w:rPr>
@@ -68,10 +171,10 @@
     </w:p>
     <w:p>
       <w:pPr>
-        <w:spacing w:before="160" w:after="40"/>
         <w:pBdr>
           <w:bottom w:val="single" w:sz="6" w:space="1" w:color="000000"/>
         </w:pBdr>
+        <w:spacing w:before="240" w:after="60"/>
       </w:pPr>
       <w:r>
         <w:rPr>
@@ -85,121 +188,227 @@
     </w:p>
     <w:p>
       <w:pPr>
-        <w:tabs>
-          <w:tab w:pos="10512" w:val="right"/>
-        </w:tabs>
-        <w:spacing w:before="80"/>
+        <w:spacing w:after="0" w:before="0" w:line="120" w:lineRule="exact"/>
       </w:pPr>
-      <w:r>
-        <w:rPr>
-          <w:rFonts w:ascii="Calibri" w:hAnsi="Calibri"/>
-          <w:b/>
-          <w:i w:val="0"/>
-          <w:sz w:val="21"/>
-        </w:rPr>
-        <w:t>Progress High School</w:t>
-      </w:r>
-      <w:r>
-        <w:rPr>
-          <w:rFonts w:ascii="Calibri" w:hAnsi="Calibri"/>
-          <w:b w:val="0"/>
-          <w:i w:val="0"/>
-          <w:sz w:val="21"/>
-        </w:rPr>
-        <w:tab/>
-        <w:t>Pretoria</w:t>
-      </w:r>
     </w:p>
+    <w:tbl>
+      <w:tblPr>
+        <w:tblW w:type="auto" w:w="0"/>
+        <w:jc w:val="left"/>
+        <w:tblLook w:firstColumn="1" w:firstRow="1" w:lastColumn="0" w:lastRow="0" w:noHBand="0" w:noVBand="1" w:val="04A0"/>
+        <w:tblBorders>
+          <w:top w:val="none" w:sz="0" w:space="0"/>
+          <w:left w:val="none" w:sz="0" w:space="0"/>
+          <w:bottom w:val="none" w:sz="0" w:space="0"/>
+          <w:right w:val="none" w:sz="0" w:space="0"/>
+          <w:insideH w:val="none" w:sz="0" w:space="0"/>
+          <w:insideV w:val="none" w:sz="0" w:space="0"/>
+        </w:tblBorders>
+        <w:tblLayout w:type="fixed"/>
+      </w:tblPr>
+      <w:tblGrid>
+        <w:gridCol w:w="5256"/>
+        <w:gridCol w:w="5256"/>
+      </w:tblGrid>
+      <w:tr>
+        <w:tc>
+          <w:tcPr>
+            <w:tcW w:type="dxa" w:w="1800"/>
+            <w:tcMar>
+              <w:top w:w="0" w:type="dxa"/>
+              <w:left w:w="0" w:type="dxa"/>
+              <w:bottom w:w="0" w:type="dxa"/>
+              <w:right w:w="120" w:type="dxa"/>
+            </w:tcMar>
+            <w:vAlign w:val="top"/>
+          </w:tcPr>
+          <w:p>
+            <w:pPr>
+              <w:spacing w:before="20"/>
+            </w:pPr>
+            <w:r>
+              <w:rPr>
+                <w:rFonts w:ascii="Calibri" w:hAnsi="Calibri"/>
+                <w:b w:val="0"/>
+                <w:i w:val="0"/>
+                <w:color w:val="555555"/>
+                <w:sz w:val="19"/>
+              </w:rPr>
+              <w:t>Pretoria</w:t>
+            </w:r>
+          </w:p>
+        </w:tc>
+        <w:tc>
+          <w:tcPr>
+            <w:tcW w:type="dxa" w:w="8712"/>
+            <w:tcMar>
+              <w:top w:w="0" w:type="dxa"/>
+              <w:left w:w="0" w:type="dxa"/>
+              <w:bottom w:w="0" w:type="dxa"/>
+              <w:right w:w="0" w:type="dxa"/>
+            </w:tcMar>
+            <w:vAlign w:val="top"/>
+          </w:tcPr>
+          <w:p>
+            <w:pPr>
+              <w:spacing w:after="0"/>
+            </w:pPr>
+            <w:r>
+              <w:rPr>
+                <w:rFonts w:ascii="Calibri" w:hAnsi="Calibri"/>
+                <w:b/>
+                <w:i w:val="0"/>
+                <w:sz w:val="21"/>
+              </w:rPr>
+              <w:t>Progress High School</w:t>
+            </w:r>
+          </w:p>
+          <w:p>
+            <w:pPr>
+              <w:spacing w:after="0"/>
+            </w:pPr>
+            <w:r>
+              <w:rPr>
+                <w:rFonts w:ascii="Calibri" w:hAnsi="Calibri"/>
+                <w:b w:val="0"/>
+                <w:i/>
+                <w:sz w:val="21"/>
+              </w:rPr>
+              <w:t>Matric / Grade 12</w:t>
+            </w:r>
+          </w:p>
+          <w:p>
+            <w:pPr>
+              <w:pStyle w:val="ListBullet"/>
+              <w:spacing w:before="0" w:after="0" w:line="240" w:lineRule="auto"/>
+              <w:ind w:left="317" w:hanging="230"/>
+            </w:pPr>
+            <w:r>
+              <w:rPr>
+                <w:rFonts w:ascii="Calibri" w:hAnsi="Calibri"/>
+                <w:b w:val="0"/>
+                <w:i w:val="0"/>
+                <w:sz w:val="21"/>
+              </w:rPr>
+              <w:t>Studied Tsonga, English, Maths, Biology, and Criminology.</w:t>
+            </w:r>
+          </w:p>
+        </w:tc>
+      </w:tr>
+    </w:tbl>
     <w:p>
       <w:pPr>
-        <w:spacing w:before="0"/>
+        <w:spacing w:after="0" w:before="0" w:line="160" w:lineRule="exact"/>
       </w:pPr>
-      <w:r>
-        <w:rPr>
-          <w:rFonts w:ascii="Calibri" w:hAnsi="Calibri"/>
-          <w:b w:val="0"/>
-          <w:i/>
-          <w:sz w:val="21"/>
-        </w:rPr>
-        <w:t>Matric / Grade 12</w:t>
-      </w:r>
     </w:p>
+    <w:tbl>
+      <w:tblPr>
+        <w:tblW w:type="auto" w:w="0"/>
+        <w:jc w:val="left"/>
+        <w:tblLook w:firstColumn="1" w:firstRow="1" w:lastColumn="0" w:lastRow="0" w:noHBand="0" w:noVBand="1" w:val="04A0"/>
+        <w:tblBorders>
+          <w:top w:val="none" w:sz="0" w:space="0"/>
+          <w:left w:val="none" w:sz="0" w:space="0"/>
+          <w:bottom w:val="none" w:sz="0" w:space="0"/>
+          <w:right w:val="none" w:sz="0" w:space="0"/>
+          <w:insideH w:val="none" w:sz="0" w:space="0"/>
+          <w:insideV w:val="none" w:sz="0" w:space="0"/>
+        </w:tblBorders>
+        <w:tblLayout w:type="fixed"/>
+      </w:tblPr>
+      <w:tblGrid>
+        <w:gridCol w:w="5256"/>
+        <w:gridCol w:w="5256"/>
+      </w:tblGrid>
+      <w:tr>
+        <w:tc>
+          <w:tcPr>
+            <w:tcW w:type="dxa" w:w="1800"/>
+            <w:tcMar>
+              <w:top w:w="0" w:type="dxa"/>
+              <w:left w:w="0" w:type="dxa"/>
+              <w:bottom w:w="0" w:type="dxa"/>
+              <w:right w:w="120" w:type="dxa"/>
+            </w:tcMar>
+            <w:vAlign w:val="top"/>
+          </w:tcPr>
+          <w:p>
+            <w:pPr>
+              <w:spacing w:before="20"/>
+            </w:pPr>
+            <w:r>
+              <w:rPr>
+                <w:rFonts w:ascii="Calibri" w:hAnsi="Calibri"/>
+                <w:b w:val="0"/>
+                <w:i w:val="0"/>
+                <w:color w:val="555555"/>
+                <w:sz w:val="19"/>
+              </w:rPr>
+              <w:t>Pretoria</w:t>
+            </w:r>
+          </w:p>
+        </w:tc>
+        <w:tc>
+          <w:tcPr>
+            <w:tcW w:type="dxa" w:w="8712"/>
+            <w:tcMar>
+              <w:top w:w="0" w:type="dxa"/>
+              <w:left w:w="0" w:type="dxa"/>
+              <w:bottom w:w="0" w:type="dxa"/>
+              <w:right w:w="0" w:type="dxa"/>
+            </w:tcMar>
+            <w:vAlign w:val="top"/>
+          </w:tcPr>
+          <w:p>
+            <w:pPr>
+              <w:spacing w:after="0"/>
+            </w:pPr>
+            <w:r>
+              <w:rPr>
+                <w:rFonts w:ascii="Calibri" w:hAnsi="Calibri"/>
+                <w:b/>
+                <w:i w:val="0"/>
+                <w:sz w:val="21"/>
+              </w:rPr>
+              <w:t>College Campus</w:t>
+            </w:r>
+          </w:p>
+          <w:p>
+            <w:pPr>
+              <w:spacing w:after="0"/>
+            </w:pPr>
+            <w:r>
+              <w:rPr>
+                <w:rFonts w:ascii="Calibri" w:hAnsi="Calibri"/>
+                <w:b w:val="0"/>
+                <w:i/>
+                <w:sz w:val="21"/>
+              </w:rPr>
+              <w:t>Diploma, PC Engineering</w:t>
+            </w:r>
+          </w:p>
+          <w:p>
+            <w:pPr>
+              <w:pStyle w:val="ListBullet"/>
+              <w:spacing w:before="0" w:after="0" w:line="240" w:lineRule="auto"/>
+              <w:ind w:left="317" w:hanging="230"/>
+            </w:pPr>
+            <w:r>
+              <w:rPr>
+                <w:rFonts w:ascii="Calibri" w:hAnsi="Calibri"/>
+                <w:b w:val="0"/>
+                <w:i w:val="0"/>
+                <w:sz w:val="21"/>
+              </w:rPr>
+              <w:t>Completed modules in A+, N+, Information Systems 1, Business Management, Business Communication, and PC Literacy.</w:t>
+            </w:r>
+          </w:p>
+        </w:tc>
+      </w:tr>
+    </w:tbl>
     <w:p>
       <w:pPr>
-        <w:pStyle w:val="ListBullet"/>
-        <w:spacing w:before="0" w:after="0" w:line="240" w:lineRule="auto"/>
-        <w:ind w:left="360" w:hanging="230"/>
-      </w:pPr>
-      <w:r>
-        <w:rPr>
-          <w:rFonts w:ascii="Calibri" w:hAnsi="Calibri"/>
-          <w:b w:val="0"/>
-          <w:i w:val="0"/>
-          <w:sz w:val="21"/>
-        </w:rPr>
-        <w:t>Studied Tsonga, English, Maths, Biology, and Criminology.</w:t>
-      </w:r>
-    </w:p>
-    <w:p>
-      <w:pPr>
-        <w:tabs>
-          <w:tab w:pos="10512" w:val="right"/>
-        </w:tabs>
-        <w:spacing w:before="80"/>
-      </w:pPr>
-      <w:r>
-        <w:rPr>
-          <w:rFonts w:ascii="Calibri" w:hAnsi="Calibri"/>
-          <w:b/>
-          <w:i w:val="0"/>
-          <w:sz w:val="21"/>
-        </w:rPr>
-        <w:t>College Campus</w:t>
-      </w:r>
-      <w:r>
-        <w:rPr>
-          <w:rFonts w:ascii="Calibri" w:hAnsi="Calibri"/>
-          <w:b w:val="0"/>
-          <w:i w:val="0"/>
-          <w:sz w:val="21"/>
-        </w:rPr>
-        <w:tab/>
-        <w:t>Pretoria</w:t>
-      </w:r>
-    </w:p>
-    <w:p>
-      <w:pPr>
-        <w:spacing w:before="0"/>
-      </w:pPr>
-      <w:r>
-        <w:rPr>
-          <w:rFonts w:ascii="Calibri" w:hAnsi="Calibri"/>
-          <w:b w:val="0"/>
-          <w:i/>
-          <w:sz w:val="21"/>
-        </w:rPr>
-        <w:t>Diploma, PC Engineering</w:t>
-      </w:r>
-    </w:p>
-    <w:p>
-      <w:pPr>
-        <w:pStyle w:val="ListBullet"/>
-        <w:spacing w:before="0" w:after="0" w:line="240" w:lineRule="auto"/>
-        <w:ind w:left="360" w:hanging="230"/>
-      </w:pPr>
-      <w:r>
-        <w:rPr>
-          <w:rFonts w:ascii="Calibri" w:hAnsi="Calibri"/>
-          <w:b w:val="0"/>
-          <w:i w:val="0"/>
-          <w:sz w:val="21"/>
-        </w:rPr>
-        <w:t>Completed modules in A+, N+, Information Systems 1, Business Management, Business Communication, and PC Literacy.</w:t>
-      </w:r>
-    </w:p>
-    <w:p>
-      <w:pPr>
-        <w:spacing w:before="80"/>
+        <w:spacing w:before="140"/>
       </w:pPr>
       <w:r>
         <w:rPr>
@@ -222,10 +431,10 @@
     </w:p>
     <w:p>
       <w:pPr>
-        <w:spacing w:before="160" w:after="40"/>
         <w:pBdr>
           <w:bottom w:val="single" w:sz="6" w:space="1" w:color="000000"/>
         </w:pBdr>
+        <w:spacing w:before="240" w:after="60"/>
       </w:pPr>
       <w:r>
         <w:rPr>
@@ -239,1466 +448,1866 @@
     </w:p>
     <w:p>
       <w:pPr>
-        <w:tabs>
-          <w:tab w:pos="10512" w:val="right"/>
-        </w:tabs>
-        <w:spacing w:before="120"/>
+        <w:spacing w:after="0" w:before="0" w:line="120" w:lineRule="exact"/>
       </w:pPr>
-      <w:r>
-        <w:rPr>
-          <w:rFonts w:ascii="Calibri" w:hAnsi="Calibri"/>
-          <w:b/>
-          <w:i w:val="0"/>
-          <w:sz w:val="21"/>
-        </w:rPr>
-        <w:t>Appleworx / Sizwe IT Group  |  Pretoria</w:t>
-      </w:r>
     </w:p>
+    <w:tbl>
+      <w:tblPr>
+        <w:tblW w:type="auto" w:w="0"/>
+        <w:jc w:val="left"/>
+        <w:tblLook w:firstColumn="1" w:firstRow="1" w:lastColumn="0" w:lastRow="0" w:noHBand="0" w:noVBand="1" w:val="04A0"/>
+        <w:tblBorders>
+          <w:top w:val="none" w:sz="0" w:space="0"/>
+          <w:left w:val="none" w:sz="0" w:space="0"/>
+          <w:bottom w:val="none" w:sz="0" w:space="0"/>
+          <w:right w:val="none" w:sz="0" w:space="0"/>
+          <w:insideH w:val="none" w:sz="0" w:space="0"/>
+          <w:insideV w:val="none" w:sz="0" w:space="0"/>
+        </w:tblBorders>
+        <w:tblLayout w:type="fixed"/>
+      </w:tblPr>
+      <w:tblGrid>
+        <w:gridCol w:w="5256"/>
+        <w:gridCol w:w="5256"/>
+      </w:tblGrid>
+      <w:tr>
+        <w:tc>
+          <w:tcPr>
+            <w:tcW w:type="dxa" w:w="1800"/>
+            <w:tcMar>
+              <w:top w:w="0" w:type="dxa"/>
+              <w:left w:w="0" w:type="dxa"/>
+              <w:bottom w:w="0" w:type="dxa"/>
+              <w:right w:w="120" w:type="dxa"/>
+            </w:tcMar>
+            <w:vAlign w:val="top"/>
+          </w:tcPr>
+          <w:p>
+            <w:pPr>
+              <w:spacing w:before="20"/>
+            </w:pPr>
+            <w:r>
+              <w:rPr>
+                <w:rFonts w:ascii="Calibri" w:hAnsi="Calibri"/>
+                <w:b w:val="0"/>
+                <w:i w:val="0"/>
+                <w:color w:val="555555"/>
+                <w:sz w:val="19"/>
+              </w:rPr>
+              <w:t>06/2021 – 01/2026</w:t>
+            </w:r>
+          </w:p>
+        </w:tc>
+        <w:tc>
+          <w:tcPr>
+            <w:tcW w:type="dxa" w:w="8712"/>
+            <w:tcMar>
+              <w:top w:w="0" w:type="dxa"/>
+              <w:left w:w="0" w:type="dxa"/>
+              <w:bottom w:w="0" w:type="dxa"/>
+              <w:right w:w="0" w:type="dxa"/>
+            </w:tcMar>
+            <w:vAlign w:val="top"/>
+          </w:tcPr>
+          <w:p>
+            <w:pPr>
+              <w:spacing w:after="0"/>
+            </w:pPr>
+            <w:r>
+              <w:rPr>
+                <w:rFonts w:ascii="Calibri" w:hAnsi="Calibri"/>
+                <w:b/>
+                <w:i w:val="0"/>
+                <w:sz w:val="21"/>
+              </w:rPr>
+              <w:t>Appleworx / Sizwe IT Group  |  Pretoria</w:t>
+            </w:r>
+          </w:p>
+          <w:p>
+            <w:pPr>
+              <w:spacing w:after="0"/>
+            </w:pPr>
+            <w:r>
+              <w:rPr>
+                <w:rFonts w:ascii="Calibri" w:hAnsi="Calibri"/>
+                <w:b w:val="0"/>
+                <w:i w:val="0"/>
+                <w:sz w:val="21"/>
+              </w:rPr>
+              <w:t>Support Engineer</w:t>
+            </w:r>
+          </w:p>
+          <w:p>
+            <w:pPr>
+              <w:pStyle w:val="ListBullet"/>
+              <w:spacing w:before="0" w:after="0" w:line="240" w:lineRule="auto"/>
+              <w:ind w:left="317" w:hanging="230"/>
+            </w:pPr>
+            <w:r>
+              <w:rPr>
+                <w:rFonts w:ascii="Calibri" w:hAnsi="Calibri"/>
+                <w:b w:val="0"/>
+                <w:i w:val="0"/>
+                <w:sz w:val="21"/>
+              </w:rPr>
+              <w:t>Managed comprehensive hardware and software maintenance for SAPS divisions including Crime Intelligence, DPCI, Silverton Forensic, and Supply Chain Management.</w:t>
+            </w:r>
+          </w:p>
+          <w:p>
+            <w:pPr>
+              <w:pStyle w:val="ListBullet"/>
+              <w:spacing w:before="0" w:after="0" w:line="240" w:lineRule="auto"/>
+              <w:ind w:left="317" w:hanging="230"/>
+            </w:pPr>
+            <w:r>
+              <w:rPr>
+                <w:rFonts w:ascii="Calibri" w:hAnsi="Calibri"/>
+                <w:b w:val="0"/>
+                <w:i w:val="0"/>
+                <w:sz w:val="21"/>
+              </w:rPr>
+              <w:t>Executed repairs and configurations for Dell, Proline, Toshiba, and Lenovo laptops.</w:t>
+            </w:r>
+          </w:p>
+          <w:p>
+            <w:pPr>
+              <w:pStyle w:val="ListBullet"/>
+              <w:spacing w:before="0" w:after="0" w:line="240" w:lineRule="auto"/>
+              <w:ind w:left="317" w:hanging="230"/>
+            </w:pPr>
+            <w:r>
+              <w:rPr>
+                <w:rFonts w:ascii="Calibri" w:hAnsi="Calibri"/>
+                <w:b w:val="0"/>
+                <w:i w:val="0"/>
+                <w:sz w:val="21"/>
+              </w:rPr>
+              <w:t>Performed root cause analysis to address and resolve recurring technical issues.</w:t>
+            </w:r>
+          </w:p>
+          <w:p>
+            <w:pPr>
+              <w:pStyle w:val="ListBullet"/>
+              <w:spacing w:before="0" w:after="0" w:line="240" w:lineRule="auto"/>
+              <w:ind w:left="317" w:hanging="230"/>
+            </w:pPr>
+            <w:r>
+              <w:rPr>
+                <w:rFonts w:ascii="Calibri" w:hAnsi="Calibri"/>
+                <w:b w:val="0"/>
+                <w:i w:val="0"/>
+                <w:sz w:val="21"/>
+              </w:rPr>
+              <w:t>Configured printers for seamless integration with the SAPS domain.</w:t>
+            </w:r>
+          </w:p>
+          <w:p>
+            <w:pPr>
+              <w:pStyle w:val="ListBullet"/>
+              <w:spacing w:before="0" w:after="0" w:line="240" w:lineRule="auto"/>
+              <w:ind w:left="317" w:hanging="230"/>
+            </w:pPr>
+            <w:r>
+              <w:rPr>
+                <w:rFonts w:ascii="Calibri" w:hAnsi="Calibri"/>
+                <w:b w:val="0"/>
+                <w:i w:val="0"/>
+                <w:sz w:val="21"/>
+              </w:rPr>
+              <w:t>Administered network configurations to ensure optimal connectivity.</w:t>
+            </w:r>
+          </w:p>
+          <w:p>
+            <w:pPr>
+              <w:pStyle w:val="ListBullet"/>
+              <w:spacing w:before="0" w:after="0" w:line="240" w:lineRule="auto"/>
+              <w:ind w:left="317" w:hanging="230"/>
+            </w:pPr>
+            <w:r>
+              <w:rPr>
+                <w:rFonts w:ascii="Calibri" w:hAnsi="Calibri"/>
+                <w:b w:val="0"/>
+                <w:i w:val="0"/>
+                <w:sz w:val="21"/>
+              </w:rPr>
+              <w:t>Managed mainframe configurations and operational readiness.</w:t>
+            </w:r>
+          </w:p>
+          <w:p>
+            <w:pPr>
+              <w:pStyle w:val="ListBullet"/>
+              <w:spacing w:before="0" w:after="0" w:line="240" w:lineRule="auto"/>
+              <w:ind w:left="317" w:hanging="230"/>
+            </w:pPr>
+            <w:r>
+              <w:rPr>
+                <w:rFonts w:ascii="Calibri" w:hAnsi="Calibri"/>
+                <w:b w:val="0"/>
+                <w:i w:val="0"/>
+                <w:sz w:val="21"/>
+              </w:rPr>
+              <w:t>Oversaw SAPS domain configurations, maintaining system integrity.</w:t>
+            </w:r>
+          </w:p>
+          <w:p>
+            <w:pPr>
+              <w:pStyle w:val="ListBullet"/>
+              <w:spacing w:before="0" w:after="0" w:line="240" w:lineRule="auto"/>
+              <w:ind w:left="317" w:hanging="230"/>
+            </w:pPr>
+            <w:r>
+              <w:rPr>
+                <w:rFonts w:ascii="Calibri" w:hAnsi="Calibri"/>
+                <w:b w:val="0"/>
+                <w:i w:val="0"/>
+                <w:sz w:val="21"/>
+              </w:rPr>
+              <w:t>Set up and managed email accounts and systems for end-users.</w:t>
+            </w:r>
+          </w:p>
+          <w:p>
+            <w:pPr>
+              <w:pStyle w:val="ListBullet"/>
+              <w:spacing w:before="0" w:after="0" w:line="240" w:lineRule="auto"/>
+              <w:ind w:left="317" w:hanging="230"/>
+            </w:pPr>
+            <w:r>
+              <w:rPr>
+                <w:rFonts w:ascii="Calibri" w:hAnsi="Calibri"/>
+                <w:b w:val="0"/>
+                <w:i w:val="0"/>
+                <w:sz w:val="21"/>
+              </w:rPr>
+              <w:t>Utilised Active Directory for user management and access control.</w:t>
+            </w:r>
+          </w:p>
+          <w:p>
+            <w:pPr>
+              <w:pStyle w:val="ListBullet"/>
+              <w:spacing w:before="0" w:after="0" w:line="240" w:lineRule="auto"/>
+              <w:ind w:left="317" w:hanging="230"/>
+            </w:pPr>
+            <w:r>
+              <w:rPr>
+                <w:rFonts w:ascii="Calibri" w:hAnsi="Calibri"/>
+                <w:b w:val="0"/>
+                <w:i w:val="0"/>
+                <w:sz w:val="21"/>
+              </w:rPr>
+              <w:t>Resolved support tickets within Service Level Agreements (SLAs).</w:t>
+            </w:r>
+          </w:p>
+        </w:tc>
+      </w:tr>
+    </w:tbl>
     <w:p>
       <w:pPr>
-        <w:tabs>
-          <w:tab w:pos="10512" w:val="right"/>
-        </w:tabs>
-        <w:spacing w:before="0"/>
+        <w:spacing w:after="0" w:before="0" w:line="220" w:lineRule="exact"/>
       </w:pPr>
-      <w:r>
-        <w:rPr>
-          <w:rFonts w:ascii="Calibri" w:hAnsi="Calibri"/>
-          <w:b w:val="0"/>
-          <w:i w:val="0"/>
-          <w:sz w:val="21"/>
-        </w:rPr>
-        <w:t>Support Engineer</w:t>
-      </w:r>
-      <w:r>
-        <w:rPr>
-          <w:rFonts w:ascii="Calibri" w:hAnsi="Calibri"/>
-          <w:b w:val="0"/>
-          <w:i w:val="0"/>
-          <w:sz w:val="21"/>
-        </w:rPr>
-        <w:tab/>
-        <w:t>06/2021 – 01/2026</w:t>
-      </w:r>
     </w:p>
+    <w:tbl>
+      <w:tblPr>
+        <w:tblW w:type="auto" w:w="0"/>
+        <w:jc w:val="left"/>
+        <w:tblLook w:firstColumn="1" w:firstRow="1" w:lastColumn="0" w:lastRow="0" w:noHBand="0" w:noVBand="1" w:val="04A0"/>
+        <w:tblBorders>
+          <w:top w:val="none" w:sz="0" w:space="0"/>
+          <w:left w:val="none" w:sz="0" w:space="0"/>
+          <w:bottom w:val="none" w:sz="0" w:space="0"/>
+          <w:right w:val="none" w:sz="0" w:space="0"/>
+          <w:insideH w:val="none" w:sz="0" w:space="0"/>
+          <w:insideV w:val="none" w:sz="0" w:space="0"/>
+        </w:tblBorders>
+        <w:tblLayout w:type="fixed"/>
+      </w:tblPr>
+      <w:tblGrid>
+        <w:gridCol w:w="5256"/>
+        <w:gridCol w:w="5256"/>
+      </w:tblGrid>
+      <w:tr>
+        <w:tc>
+          <w:tcPr>
+            <w:tcW w:type="dxa" w:w="1800"/>
+            <w:tcMar>
+              <w:top w:w="0" w:type="dxa"/>
+              <w:left w:w="0" w:type="dxa"/>
+              <w:bottom w:w="0" w:type="dxa"/>
+              <w:right w:w="120" w:type="dxa"/>
+            </w:tcMar>
+            <w:vAlign w:val="top"/>
+          </w:tcPr>
+          <w:p>
+            <w:pPr>
+              <w:spacing w:before="20"/>
+            </w:pPr>
+            <w:r>
+              <w:rPr>
+                <w:rFonts w:ascii="Calibri" w:hAnsi="Calibri"/>
+                <w:b w:val="0"/>
+                <w:i w:val="0"/>
+                <w:color w:val="555555"/>
+                <w:sz w:val="19"/>
+              </w:rPr>
+              <w:t>02/2018 – 10/2019</w:t>
+            </w:r>
+          </w:p>
+        </w:tc>
+        <w:tc>
+          <w:tcPr>
+            <w:tcW w:type="dxa" w:w="8712"/>
+            <w:tcMar>
+              <w:top w:w="0" w:type="dxa"/>
+              <w:left w:w="0" w:type="dxa"/>
+              <w:bottom w:w="0" w:type="dxa"/>
+              <w:right w:w="0" w:type="dxa"/>
+            </w:tcMar>
+            <w:vAlign w:val="top"/>
+          </w:tcPr>
+          <w:p>
+            <w:pPr>
+              <w:spacing w:after="0"/>
+            </w:pPr>
+            <w:r>
+              <w:rPr>
+                <w:rFonts w:ascii="Calibri" w:hAnsi="Calibri"/>
+                <w:b/>
+                <w:i w:val="0"/>
+                <w:sz w:val="21"/>
+              </w:rPr>
+              <w:t>Sizwe IT Group  |  Pretoria</w:t>
+            </w:r>
+          </w:p>
+          <w:p>
+            <w:pPr>
+              <w:spacing w:after="0"/>
+            </w:pPr>
+            <w:r>
+              <w:rPr>
+                <w:rFonts w:ascii="Calibri" w:hAnsi="Calibri"/>
+                <w:b w:val="0"/>
+                <w:i w:val="0"/>
+                <w:sz w:val="21"/>
+              </w:rPr>
+              <w:t>Migration Consultant</w:t>
+            </w:r>
+          </w:p>
+          <w:p>
+            <w:pPr>
+              <w:pStyle w:val="ListBullet"/>
+              <w:spacing w:before="0" w:after="0" w:line="240" w:lineRule="auto"/>
+              <w:ind w:left="317" w:hanging="230"/>
+            </w:pPr>
+            <w:r>
+              <w:rPr>
+                <w:rFonts w:ascii="Calibri" w:hAnsi="Calibri"/>
+                <w:b w:val="0"/>
+                <w:i w:val="0"/>
+                <w:sz w:val="21"/>
+              </w:rPr>
+              <w:t>Executed mailbox migrations between Exchange 2013/2016 and Office 365 environments.</w:t>
+            </w:r>
+          </w:p>
+          <w:p>
+            <w:pPr>
+              <w:pStyle w:val="ListBullet"/>
+              <w:spacing w:before="0" w:after="0" w:line="240" w:lineRule="auto"/>
+              <w:ind w:left="317" w:hanging="230"/>
+            </w:pPr>
+            <w:r>
+              <w:rPr>
+                <w:rFonts w:ascii="Calibri" w:hAnsi="Calibri"/>
+                <w:b w:val="0"/>
+                <w:i w:val="0"/>
+                <w:sz w:val="21"/>
+              </w:rPr>
+              <w:t>Provided post-migration deployment and support, ensuring smooth transitions for users.</w:t>
+            </w:r>
+          </w:p>
+          <w:p>
+            <w:pPr>
+              <w:pStyle w:val="ListBullet"/>
+              <w:spacing w:before="0" w:after="0" w:line="240" w:lineRule="auto"/>
+              <w:ind w:left="317" w:hanging="230"/>
+            </w:pPr>
+            <w:r>
+              <w:rPr>
+                <w:rFonts w:ascii="Calibri" w:hAnsi="Calibri"/>
+                <w:b w:val="0"/>
+                <w:i w:val="0"/>
+                <w:sz w:val="21"/>
+              </w:rPr>
+              <w:t>Delivered 3rd line support for Exchange and Active Directory user roles.</w:t>
+            </w:r>
+          </w:p>
+          <w:p>
+            <w:pPr>
+              <w:pStyle w:val="ListBullet"/>
+              <w:spacing w:before="0" w:after="0" w:line="240" w:lineRule="auto"/>
+              <w:ind w:left="317" w:hanging="230"/>
+            </w:pPr>
+            <w:r>
+              <w:rPr>
+                <w:rFonts w:ascii="Calibri" w:hAnsi="Calibri"/>
+                <w:b w:val="0"/>
+                <w:i w:val="0"/>
+                <w:sz w:val="21"/>
+              </w:rPr>
+              <w:t>Managed request and service fulfillment for messaging systems.</w:t>
+            </w:r>
+          </w:p>
+          <w:p>
+            <w:pPr>
+              <w:pStyle w:val="ListBullet"/>
+              <w:spacing w:before="0" w:after="0" w:line="240" w:lineRule="auto"/>
+              <w:ind w:left="317" w:hanging="230"/>
+            </w:pPr>
+            <w:r>
+              <w:rPr>
+                <w:rFonts w:ascii="Calibri" w:hAnsi="Calibri"/>
+                <w:b w:val="0"/>
+                <w:i w:val="0"/>
+                <w:sz w:val="21"/>
+              </w:rPr>
+              <w:t>Implemented and supported Mobile Device Management solutions including BlackBerry Work, Outlook Mobile, and Intune.</w:t>
+            </w:r>
+          </w:p>
+          <w:p>
+            <w:pPr>
+              <w:pStyle w:val="ListBullet"/>
+              <w:spacing w:before="0" w:after="0" w:line="240" w:lineRule="auto"/>
+              <w:ind w:left="317" w:hanging="230"/>
+            </w:pPr>
+            <w:r>
+              <w:rPr>
+                <w:rFonts w:ascii="Calibri" w:hAnsi="Calibri"/>
+                <w:b w:val="0"/>
+                <w:i w:val="0"/>
+                <w:sz w:val="21"/>
+              </w:rPr>
+              <w:t>Assumed ownership of unresolved support issues, escalating as necessary to senior teams.</w:t>
+            </w:r>
+          </w:p>
+          <w:p>
+            <w:pPr>
+              <w:pStyle w:val="ListBullet"/>
+              <w:spacing w:before="0" w:after="0" w:line="240" w:lineRule="auto"/>
+              <w:ind w:left="317" w:hanging="230"/>
+            </w:pPr>
+            <w:r>
+              <w:rPr>
+                <w:rFonts w:ascii="Calibri" w:hAnsi="Calibri"/>
+                <w:b w:val="0"/>
+                <w:i w:val="0"/>
+                <w:sz w:val="21"/>
+              </w:rPr>
+              <w:t>Authored Standard Operating Procedures for technicians, enhancing knowledge transfer.</w:t>
+            </w:r>
+          </w:p>
+          <w:p>
+            <w:pPr>
+              <w:pStyle w:val="ListBullet"/>
+              <w:spacing w:before="0" w:after="0" w:line="240" w:lineRule="auto"/>
+              <w:ind w:left="317" w:hanging="230"/>
+            </w:pPr>
+            <w:r>
+              <w:rPr>
+                <w:rFonts w:ascii="Calibri" w:hAnsi="Calibri"/>
+                <w:b w:val="0"/>
+                <w:i w:val="0"/>
+                <w:sz w:val="21"/>
+              </w:rPr>
+              <w:t>Adhered to established SLAs and Change Management schedules.</w:t>
+            </w:r>
+          </w:p>
+        </w:tc>
+      </w:tr>
+    </w:tbl>
     <w:p>
       <w:pPr>
-        <w:pStyle w:val="ListBullet"/>
-        <w:spacing w:before="0" w:after="0" w:line="240" w:lineRule="auto"/>
-        <w:ind w:left="360" w:hanging="230"/>
+        <w:spacing w:after="0" w:before="0" w:line="220" w:lineRule="exact"/>
       </w:pPr>
-      <w:r>
-        <w:rPr>
-          <w:rFonts w:ascii="Calibri" w:hAnsi="Calibri"/>
-          <w:b w:val="0"/>
-          <w:i w:val="0"/>
-          <w:sz w:val="21"/>
-        </w:rPr>
-        <w:t>Managed comprehensive hardware and software maintenance for SAPS divisions including Crime Intelligence, DPCI, Silverton Forensic, and Supply Chain Management.</w:t>
-      </w:r>
     </w:p>
+    <w:tbl>
+      <w:tblPr>
+        <w:tblW w:type="auto" w:w="0"/>
+        <w:jc w:val="left"/>
+        <w:tblLook w:firstColumn="1" w:firstRow="1" w:lastColumn="0" w:lastRow="0" w:noHBand="0" w:noVBand="1" w:val="04A0"/>
+        <w:tblBorders>
+          <w:top w:val="none" w:sz="0" w:space="0"/>
+          <w:left w:val="none" w:sz="0" w:space="0"/>
+          <w:bottom w:val="none" w:sz="0" w:space="0"/>
+          <w:right w:val="none" w:sz="0" w:space="0"/>
+          <w:insideH w:val="none" w:sz="0" w:space="0"/>
+          <w:insideV w:val="none" w:sz="0" w:space="0"/>
+        </w:tblBorders>
+        <w:tblLayout w:type="fixed"/>
+      </w:tblPr>
+      <w:tblGrid>
+        <w:gridCol w:w="5256"/>
+        <w:gridCol w:w="5256"/>
+      </w:tblGrid>
+      <w:tr>
+        <w:tc>
+          <w:tcPr>
+            <w:tcW w:type="dxa" w:w="1800"/>
+            <w:tcMar>
+              <w:top w:w="0" w:type="dxa"/>
+              <w:left w:w="0" w:type="dxa"/>
+              <w:bottom w:w="0" w:type="dxa"/>
+              <w:right w:w="120" w:type="dxa"/>
+            </w:tcMar>
+            <w:vAlign w:val="top"/>
+          </w:tcPr>
+          <w:p>
+            <w:pPr>
+              <w:spacing w:before="20"/>
+            </w:pPr>
+            <w:r>
+              <w:rPr>
+                <w:rFonts w:ascii="Calibri" w:hAnsi="Calibri"/>
+                <w:b w:val="0"/>
+                <w:i w:val="0"/>
+                <w:color w:val="555555"/>
+                <w:sz w:val="19"/>
+              </w:rPr>
+              <w:t>02/2017 – 01/2018</w:t>
+            </w:r>
+          </w:p>
+        </w:tc>
+        <w:tc>
+          <w:tcPr>
+            <w:tcW w:type="dxa" w:w="8712"/>
+            <w:tcMar>
+              <w:top w:w="0" w:type="dxa"/>
+              <w:left w:w="0" w:type="dxa"/>
+              <w:bottom w:w="0" w:type="dxa"/>
+              <w:right w:w="0" w:type="dxa"/>
+            </w:tcMar>
+            <w:vAlign w:val="top"/>
+          </w:tcPr>
+          <w:p>
+            <w:pPr>
+              <w:spacing w:after="0"/>
+            </w:pPr>
+            <w:r>
+              <w:rPr>
+                <w:rFonts w:ascii="Calibri" w:hAnsi="Calibri"/>
+                <w:b/>
+                <w:i w:val="0"/>
+                <w:sz w:val="21"/>
+              </w:rPr>
+              <w:t>Khauleza IT Solutions  |  Pretoria</w:t>
+            </w:r>
+          </w:p>
+          <w:p>
+            <w:pPr>
+              <w:spacing w:after="0"/>
+            </w:pPr>
+            <w:r>
+              <w:rPr>
+                <w:rFonts w:ascii="Calibri" w:hAnsi="Calibri"/>
+                <w:b w:val="0"/>
+                <w:i w:val="0"/>
+                <w:sz w:val="21"/>
+              </w:rPr>
+              <w:t>Senior Support Engineer</w:t>
+            </w:r>
+          </w:p>
+          <w:p>
+            <w:pPr>
+              <w:pStyle w:val="ListBullet"/>
+              <w:spacing w:before="0" w:after="0" w:line="240" w:lineRule="auto"/>
+              <w:ind w:left="317" w:hanging="230"/>
+            </w:pPr>
+            <w:r>
+              <w:rPr>
+                <w:rFonts w:ascii="Calibri" w:hAnsi="Calibri"/>
+                <w:b w:val="0"/>
+                <w:i w:val="0"/>
+                <w:sz w:val="21"/>
+              </w:rPr>
+              <w:t>Provided hardware and software maintenance for SAPS (Crime Intelligence, DPCI, Silverton Forensic, and Supply Chain Management).</w:t>
+            </w:r>
+          </w:p>
+          <w:p>
+            <w:pPr>
+              <w:pStyle w:val="ListBullet"/>
+              <w:spacing w:before="0" w:after="0" w:line="240" w:lineRule="auto"/>
+              <w:ind w:left="317" w:hanging="230"/>
+            </w:pPr>
+            <w:r>
+              <w:rPr>
+                <w:rFonts w:ascii="Calibri" w:hAnsi="Calibri"/>
+                <w:b w:val="0"/>
+                <w:i w:val="0"/>
+                <w:sz w:val="21"/>
+              </w:rPr>
+              <w:t>Repaired and configured Dell, Proline, Toshiba, and Lenovo laptops.</w:t>
+            </w:r>
+          </w:p>
+          <w:p>
+            <w:pPr>
+              <w:pStyle w:val="ListBullet"/>
+              <w:spacing w:before="0" w:after="0" w:line="240" w:lineRule="auto"/>
+              <w:ind w:left="317" w:hanging="230"/>
+            </w:pPr>
+            <w:r>
+              <w:rPr>
+                <w:rFonts w:ascii="Calibri" w:hAnsi="Calibri"/>
+                <w:b w:val="0"/>
+                <w:i w:val="0"/>
+                <w:sz w:val="21"/>
+              </w:rPr>
+              <w:t>Conducted root cause analysis on recurring technical problems to implement permanent solutions.</w:t>
+            </w:r>
+          </w:p>
+          <w:p>
+            <w:pPr>
+              <w:pStyle w:val="ListBullet"/>
+              <w:spacing w:before="0" w:after="0" w:line="240" w:lineRule="auto"/>
+              <w:ind w:left="317" w:hanging="230"/>
+            </w:pPr>
+            <w:r>
+              <w:rPr>
+                <w:rFonts w:ascii="Calibri" w:hAnsi="Calibri"/>
+                <w:b w:val="0"/>
+                <w:i w:val="0"/>
+                <w:sz w:val="21"/>
+              </w:rPr>
+              <w:t>Configured printers for deployment within the SAPS domain.</w:t>
+            </w:r>
+          </w:p>
+          <w:p>
+            <w:pPr>
+              <w:pStyle w:val="ListBullet"/>
+              <w:spacing w:before="0" w:after="0" w:line="240" w:lineRule="auto"/>
+              <w:ind w:left="317" w:hanging="230"/>
+            </w:pPr>
+            <w:r>
+              <w:rPr>
+                <w:rFonts w:ascii="Calibri" w:hAnsi="Calibri"/>
+                <w:b w:val="0"/>
+                <w:i w:val="0"/>
+                <w:sz w:val="21"/>
+              </w:rPr>
+              <w:t>Managed network configurations to ensure reliable connectivity.</w:t>
+            </w:r>
+          </w:p>
+          <w:p>
+            <w:pPr>
+              <w:pStyle w:val="ListBullet"/>
+              <w:spacing w:before="0" w:after="0" w:line="240" w:lineRule="auto"/>
+              <w:ind w:left="317" w:hanging="230"/>
+            </w:pPr>
+            <w:r>
+              <w:rPr>
+                <w:rFonts w:ascii="Calibri" w:hAnsi="Calibri"/>
+                <w:b w:val="0"/>
+                <w:i w:val="0"/>
+                <w:sz w:val="21"/>
+              </w:rPr>
+              <w:t>Performed mainframe configurations and system integration.</w:t>
+            </w:r>
+          </w:p>
+          <w:p>
+            <w:pPr>
+              <w:pStyle w:val="ListBullet"/>
+              <w:spacing w:before="0" w:after="0" w:line="240" w:lineRule="auto"/>
+              <w:ind w:left="317" w:hanging="230"/>
+            </w:pPr>
+            <w:r>
+              <w:rPr>
+                <w:rFonts w:ascii="Calibri" w:hAnsi="Calibri"/>
+                <w:b w:val="0"/>
+                <w:i w:val="0"/>
+                <w:sz w:val="21"/>
+              </w:rPr>
+              <w:t>Administered SAPS domain configurations, ensuring security and compliance.</w:t>
+            </w:r>
+          </w:p>
+          <w:p>
+            <w:pPr>
+              <w:pStyle w:val="ListBullet"/>
+              <w:spacing w:before="0" w:after="0" w:line="240" w:lineRule="auto"/>
+              <w:ind w:left="317" w:hanging="230"/>
+            </w:pPr>
+            <w:r>
+              <w:rPr>
+                <w:rFonts w:ascii="Calibri" w:hAnsi="Calibri"/>
+                <w:b w:val="0"/>
+                <w:i w:val="0"/>
+                <w:sz w:val="21"/>
+              </w:rPr>
+              <w:t>Set up email accounts and systems for users.</w:t>
+            </w:r>
+          </w:p>
+        </w:tc>
+      </w:tr>
+    </w:tbl>
     <w:p>
       <w:pPr>
-        <w:pStyle w:val="ListBullet"/>
-        <w:spacing w:before="0" w:after="0" w:line="240" w:lineRule="auto"/>
-        <w:ind w:left="360" w:hanging="230"/>
+        <w:spacing w:after="0" w:before="0" w:line="220" w:lineRule="exact"/>
       </w:pPr>
-      <w:r>
-        <w:rPr>
-          <w:rFonts w:ascii="Calibri" w:hAnsi="Calibri"/>
-          <w:b w:val="0"/>
-          <w:i w:val="0"/>
-          <w:sz w:val="21"/>
-        </w:rPr>
-        <w:t>Executed repairs and configurations for Dell, Proline, Toshiba, and Lenovo laptops.</w:t>
-      </w:r>
     </w:p>
+    <w:tbl>
+      <w:tblPr>
+        <w:tblW w:type="auto" w:w="0"/>
+        <w:jc w:val="left"/>
+        <w:tblLook w:firstColumn="1" w:firstRow="1" w:lastColumn="0" w:lastRow="0" w:noHBand="0" w:noVBand="1" w:val="04A0"/>
+        <w:tblBorders>
+          <w:top w:val="none" w:sz="0" w:space="0"/>
+          <w:left w:val="none" w:sz="0" w:space="0"/>
+          <w:bottom w:val="none" w:sz="0" w:space="0"/>
+          <w:right w:val="none" w:sz="0" w:space="0"/>
+          <w:insideH w:val="none" w:sz="0" w:space="0"/>
+          <w:insideV w:val="none" w:sz="0" w:space="0"/>
+        </w:tblBorders>
+        <w:tblLayout w:type="fixed"/>
+      </w:tblPr>
+      <w:tblGrid>
+        <w:gridCol w:w="5256"/>
+        <w:gridCol w:w="5256"/>
+      </w:tblGrid>
+      <w:tr>
+        <w:tc>
+          <w:tcPr>
+            <w:tcW w:type="dxa" w:w="1800"/>
+            <w:tcMar>
+              <w:top w:w="0" w:type="dxa"/>
+              <w:left w:w="0" w:type="dxa"/>
+              <w:bottom w:w="0" w:type="dxa"/>
+              <w:right w:w="120" w:type="dxa"/>
+            </w:tcMar>
+            <w:vAlign w:val="top"/>
+          </w:tcPr>
+          <w:p>
+            <w:pPr>
+              <w:spacing w:before="20"/>
+            </w:pPr>
+            <w:r>
+              <w:rPr>
+                <w:rFonts w:ascii="Calibri" w:hAnsi="Calibri"/>
+                <w:b w:val="0"/>
+                <w:i w:val="0"/>
+                <w:color w:val="555555"/>
+                <w:sz w:val="19"/>
+              </w:rPr>
+              <w:t>10/2013 – 12/2014</w:t>
+            </w:r>
+          </w:p>
+        </w:tc>
+        <w:tc>
+          <w:tcPr>
+            <w:tcW w:type="dxa" w:w="8712"/>
+            <w:tcMar>
+              <w:top w:w="0" w:type="dxa"/>
+              <w:left w:w="0" w:type="dxa"/>
+              <w:bottom w:w="0" w:type="dxa"/>
+              <w:right w:w="0" w:type="dxa"/>
+            </w:tcMar>
+            <w:vAlign w:val="top"/>
+          </w:tcPr>
+          <w:p>
+            <w:pPr>
+              <w:spacing w:after="0"/>
+            </w:pPr>
+            <w:r>
+              <w:rPr>
+                <w:rFonts w:ascii="Calibri" w:hAnsi="Calibri"/>
+                <w:b/>
+                <w:i w:val="0"/>
+                <w:sz w:val="21"/>
+              </w:rPr>
+              <w:t>Bytes Managed Solutions  |  Pretoria</w:t>
+            </w:r>
+          </w:p>
+          <w:p>
+            <w:pPr>
+              <w:spacing w:after="0"/>
+            </w:pPr>
+            <w:r>
+              <w:rPr>
+                <w:rFonts w:ascii="Calibri" w:hAnsi="Calibri"/>
+                <w:b w:val="0"/>
+                <w:i w:val="0"/>
+                <w:sz w:val="21"/>
+              </w:rPr>
+              <w:t>Senior Customer Services Representative</w:t>
+            </w:r>
+          </w:p>
+          <w:p>
+            <w:pPr>
+              <w:pStyle w:val="ListBullet"/>
+              <w:spacing w:before="0" w:after="0" w:line="240" w:lineRule="auto"/>
+              <w:ind w:left="317" w:hanging="230"/>
+            </w:pPr>
+            <w:r>
+              <w:rPr>
+                <w:rFonts w:ascii="Calibri" w:hAnsi="Calibri"/>
+                <w:b w:val="0"/>
+                <w:i w:val="0"/>
+                <w:sz w:val="21"/>
+              </w:rPr>
+              <w:t>Installed ABSA applications onto client systems.</w:t>
+            </w:r>
+          </w:p>
+          <w:p>
+            <w:pPr>
+              <w:pStyle w:val="ListBullet"/>
+              <w:spacing w:before="0" w:after="0" w:line="240" w:lineRule="auto"/>
+              <w:ind w:left="317" w:hanging="230"/>
+            </w:pPr>
+            <w:r>
+              <w:rPr>
+                <w:rFonts w:ascii="Calibri" w:hAnsi="Calibri"/>
+                <w:b w:val="0"/>
+                <w:i w:val="0"/>
+                <w:sz w:val="21"/>
+              </w:rPr>
+              <w:t>Configured and set up 3G connectivity for clients.</w:t>
+            </w:r>
+          </w:p>
+          <w:p>
+            <w:pPr>
+              <w:pStyle w:val="ListBullet"/>
+              <w:spacing w:before="0" w:after="0" w:line="240" w:lineRule="auto"/>
+              <w:ind w:left="317" w:hanging="230"/>
+            </w:pPr>
+            <w:r>
+              <w:rPr>
+                <w:rFonts w:ascii="Calibri" w:hAnsi="Calibri"/>
+                <w:b w:val="0"/>
+                <w:i w:val="0"/>
+                <w:sz w:val="21"/>
+              </w:rPr>
+              <w:t>Established VPN connections for secure remote access.</w:t>
+            </w:r>
+          </w:p>
+          <w:p>
+            <w:pPr>
+              <w:pStyle w:val="ListBullet"/>
+              <w:spacing w:before="0" w:after="0" w:line="240" w:lineRule="auto"/>
+              <w:ind w:left="317" w:hanging="230"/>
+            </w:pPr>
+            <w:r>
+              <w:rPr>
+                <w:rFonts w:ascii="Calibri" w:hAnsi="Calibri"/>
+                <w:b w:val="0"/>
+                <w:i w:val="0"/>
+                <w:sz w:val="21"/>
+              </w:rPr>
+              <w:t>Connected clients to network printers and managed print services.</w:t>
+            </w:r>
+          </w:p>
+          <w:p>
+            <w:pPr>
+              <w:pStyle w:val="ListBullet"/>
+              <w:spacing w:before="0" w:after="0" w:line="240" w:lineRule="auto"/>
+              <w:ind w:left="317" w:hanging="230"/>
+            </w:pPr>
+            <w:r>
+              <w:rPr>
+                <w:rFonts w:ascii="Calibri" w:hAnsi="Calibri"/>
+                <w:b w:val="0"/>
+                <w:i w:val="0"/>
+                <w:sz w:val="21"/>
+              </w:rPr>
+              <w:t>Set up and configured user profiles on various systems.</w:t>
+            </w:r>
+          </w:p>
+          <w:p>
+            <w:pPr>
+              <w:pStyle w:val="ListBullet"/>
+              <w:spacing w:before="0" w:after="0" w:line="240" w:lineRule="auto"/>
+              <w:ind w:left="317" w:hanging="230"/>
+            </w:pPr>
+            <w:r>
+              <w:rPr>
+                <w:rFonts w:ascii="Calibri" w:hAnsi="Calibri"/>
+                <w:b w:val="0"/>
+                <w:i w:val="0"/>
+                <w:sz w:val="21"/>
+              </w:rPr>
+              <w:t>Repaired desktop and laptop hardware components.</w:t>
+            </w:r>
+          </w:p>
+          <w:p>
+            <w:pPr>
+              <w:pStyle w:val="ListBullet"/>
+              <w:spacing w:before="0" w:after="0" w:line="240" w:lineRule="auto"/>
+              <w:ind w:left="317" w:hanging="230"/>
+            </w:pPr>
+            <w:r>
+              <w:rPr>
+                <w:rFonts w:ascii="Calibri" w:hAnsi="Calibri"/>
+                <w:b w:val="0"/>
+                <w:i w:val="0"/>
+                <w:sz w:val="21"/>
+              </w:rPr>
+              <w:t>Installed PGP encryption and other in-house developed software.</w:t>
+            </w:r>
+          </w:p>
+          <w:p>
+            <w:pPr>
+              <w:pStyle w:val="ListBullet"/>
+              <w:spacing w:before="0" w:after="0" w:line="240" w:lineRule="auto"/>
+              <w:ind w:left="317" w:hanging="230"/>
+            </w:pPr>
+            <w:r>
+              <w:rPr>
+                <w:rFonts w:ascii="Calibri" w:hAnsi="Calibri"/>
+                <w:b w:val="0"/>
+                <w:i w:val="0"/>
+                <w:sz w:val="21"/>
+              </w:rPr>
+              <w:t>Delivered in-house technical support for Barclays Bank operations.</w:t>
+            </w:r>
+          </w:p>
+          <w:p>
+            <w:pPr>
+              <w:pStyle w:val="ListBullet"/>
+              <w:spacing w:before="0" w:after="0" w:line="240" w:lineRule="auto"/>
+              <w:ind w:left="317" w:hanging="230"/>
+            </w:pPr>
+            <w:r>
+              <w:rPr>
+                <w:rFonts w:ascii="Calibri" w:hAnsi="Calibri"/>
+                <w:b w:val="0"/>
+                <w:i w:val="0"/>
+                <w:sz w:val="21"/>
+              </w:rPr>
+              <w:t>Provided Fusion support for both Barclays and Absa clients.</w:t>
+            </w:r>
+          </w:p>
+          <w:p>
+            <w:pPr>
+              <w:pStyle w:val="ListBullet"/>
+              <w:spacing w:before="0" w:after="0" w:line="240" w:lineRule="auto"/>
+              <w:ind w:left="317" w:hanging="230"/>
+            </w:pPr>
+            <w:r>
+              <w:rPr>
+                <w:rFonts w:ascii="Calibri" w:hAnsi="Calibri"/>
+                <w:b w:val="0"/>
+                <w:i w:val="0"/>
+                <w:sz w:val="21"/>
+              </w:rPr>
+              <w:t>Updated incident logs and service requests within the ServiceNow platform.</w:t>
+            </w:r>
+          </w:p>
+          <w:p>
+            <w:pPr>
+              <w:pStyle w:val="ListBullet"/>
+              <w:spacing w:before="0" w:after="0" w:line="240" w:lineRule="auto"/>
+              <w:ind w:left="317" w:hanging="230"/>
+            </w:pPr>
+            <w:r>
+              <w:rPr>
+                <w:rFonts w:ascii="Calibri" w:hAnsi="Calibri"/>
+                <w:b w:val="0"/>
+                <w:i w:val="0"/>
+                <w:sz w:val="21"/>
+              </w:rPr>
+              <w:t>Deployed applications utilising the QARS system.</w:t>
+            </w:r>
+          </w:p>
+        </w:tc>
+      </w:tr>
+    </w:tbl>
     <w:p>
       <w:pPr>
-        <w:pStyle w:val="ListBullet"/>
-        <w:spacing w:before="0" w:after="0" w:line="240" w:lineRule="auto"/>
-        <w:ind w:left="360" w:hanging="230"/>
+        <w:spacing w:after="0" w:before="0" w:line="220" w:lineRule="exact"/>
       </w:pPr>
-      <w:r>
-        <w:rPr>
-          <w:rFonts w:ascii="Calibri" w:hAnsi="Calibri"/>
-          <w:b w:val="0"/>
-          <w:i w:val="0"/>
-          <w:sz w:val="21"/>
-        </w:rPr>
-        <w:t>Performed root cause analysis to address and resolve recurring technical issues.</w:t>
-      </w:r>
     </w:p>
+    <w:tbl>
+      <w:tblPr>
+        <w:tblW w:type="auto" w:w="0"/>
+        <w:jc w:val="left"/>
+        <w:tblLook w:firstColumn="1" w:firstRow="1" w:lastColumn="0" w:lastRow="0" w:noHBand="0" w:noVBand="1" w:val="04A0"/>
+        <w:tblBorders>
+          <w:top w:val="none" w:sz="0" w:space="0"/>
+          <w:left w:val="none" w:sz="0" w:space="0"/>
+          <w:bottom w:val="none" w:sz="0" w:space="0"/>
+          <w:right w:val="none" w:sz="0" w:space="0"/>
+          <w:insideH w:val="none" w:sz="0" w:space="0"/>
+          <w:insideV w:val="none" w:sz="0" w:space="0"/>
+        </w:tblBorders>
+        <w:tblLayout w:type="fixed"/>
+      </w:tblPr>
+      <w:tblGrid>
+        <w:gridCol w:w="5256"/>
+        <w:gridCol w:w="5256"/>
+      </w:tblGrid>
+      <w:tr>
+        <w:tc>
+          <w:tcPr>
+            <w:tcW w:type="dxa" w:w="1800"/>
+            <w:tcMar>
+              <w:top w:w="0" w:type="dxa"/>
+              <w:left w:w="0" w:type="dxa"/>
+              <w:bottom w:w="0" w:type="dxa"/>
+              <w:right w:w="120" w:type="dxa"/>
+            </w:tcMar>
+            <w:vAlign w:val="top"/>
+          </w:tcPr>
+          <w:p>
+            <w:pPr>
+              <w:spacing w:before="20"/>
+            </w:pPr>
+            <w:r>
+              <w:rPr>
+                <w:rFonts w:ascii="Calibri" w:hAnsi="Calibri"/>
+                <w:b w:val="0"/>
+                <w:i w:val="0"/>
+                <w:color w:val="555555"/>
+                <w:sz w:val="19"/>
+              </w:rPr>
+              <w:t>06/2013 – 09/2013</w:t>
+            </w:r>
+          </w:p>
+        </w:tc>
+        <w:tc>
+          <w:tcPr>
+            <w:tcW w:type="dxa" w:w="8712"/>
+            <w:tcMar>
+              <w:top w:w="0" w:type="dxa"/>
+              <w:left w:w="0" w:type="dxa"/>
+              <w:bottom w:w="0" w:type="dxa"/>
+              <w:right w:w="0" w:type="dxa"/>
+            </w:tcMar>
+            <w:vAlign w:val="top"/>
+          </w:tcPr>
+          <w:p>
+            <w:pPr>
+              <w:spacing w:after="0"/>
+            </w:pPr>
+            <w:r>
+              <w:rPr>
+                <w:rFonts w:ascii="Calibri" w:hAnsi="Calibri"/>
+                <w:b/>
+                <w:i w:val="0"/>
+                <w:sz w:val="21"/>
+              </w:rPr>
+              <w:t>Datacentrix  |  Pretoria</w:t>
+            </w:r>
+          </w:p>
+          <w:p>
+            <w:pPr>
+              <w:spacing w:after="0"/>
+            </w:pPr>
+            <w:r>
+              <w:rPr>
+                <w:rFonts w:ascii="Calibri" w:hAnsi="Calibri"/>
+                <w:b w:val="0"/>
+                <w:i w:val="0"/>
+                <w:sz w:val="21"/>
+              </w:rPr>
+              <w:t>Field Service Specialist</w:t>
+            </w:r>
+          </w:p>
+          <w:p>
+            <w:pPr>
+              <w:pStyle w:val="ListBullet"/>
+              <w:spacing w:before="0" w:after="0" w:line="240" w:lineRule="auto"/>
+              <w:ind w:left="317" w:hanging="230"/>
+            </w:pPr>
+            <w:r>
+              <w:rPr>
+                <w:rFonts w:ascii="Calibri" w:hAnsi="Calibri"/>
+                <w:b w:val="0"/>
+                <w:i w:val="0"/>
+                <w:sz w:val="21"/>
+              </w:rPr>
+              <w:t>Provided desktop support to end-users with a focus on printer and scanner hardware.</w:t>
+            </w:r>
+          </w:p>
+          <w:p>
+            <w:pPr>
+              <w:pStyle w:val="ListBullet"/>
+              <w:spacing w:before="0" w:after="0" w:line="240" w:lineRule="auto"/>
+              <w:ind w:left="317" w:hanging="230"/>
+            </w:pPr>
+            <w:r>
+              <w:rPr>
+                <w:rFonts w:ascii="Calibri" w:hAnsi="Calibri"/>
+                <w:b w:val="0"/>
+                <w:i w:val="0"/>
+                <w:sz w:val="21"/>
+              </w:rPr>
+              <w:t>Established and managed VPN connections for remote access.</w:t>
+            </w:r>
+          </w:p>
+          <w:p>
+            <w:pPr>
+              <w:pStyle w:val="ListBullet"/>
+              <w:spacing w:before="0" w:after="0" w:line="240" w:lineRule="auto"/>
+              <w:ind w:left="317" w:hanging="230"/>
+            </w:pPr>
+            <w:r>
+              <w:rPr>
+                <w:rFonts w:ascii="Calibri" w:hAnsi="Calibri"/>
+                <w:b w:val="0"/>
+                <w:i w:val="0"/>
+                <w:sz w:val="21"/>
+              </w:rPr>
+              <w:t>Configured proxy settings for network and internet access.</w:t>
+            </w:r>
+          </w:p>
+          <w:p>
+            <w:pPr>
+              <w:pStyle w:val="ListBullet"/>
+              <w:spacing w:before="0" w:after="0" w:line="240" w:lineRule="auto"/>
+              <w:ind w:left="317" w:hanging="230"/>
+            </w:pPr>
+            <w:r>
+              <w:rPr>
+                <w:rFonts w:ascii="Calibri" w:hAnsi="Calibri"/>
+                <w:b w:val="0"/>
+                <w:i w:val="0"/>
+                <w:sz w:val="21"/>
+              </w:rPr>
+              <w:t>Set up and maintained LAN/WAN connections.</w:t>
+            </w:r>
+          </w:p>
+          <w:p>
+            <w:pPr>
+              <w:pStyle w:val="ListBullet"/>
+              <w:spacing w:before="0" w:after="0" w:line="240" w:lineRule="auto"/>
+              <w:ind w:left="317" w:hanging="230"/>
+            </w:pPr>
+            <w:r>
+              <w:rPr>
+                <w:rFonts w:ascii="Calibri" w:hAnsi="Calibri"/>
+                <w:b w:val="0"/>
+                <w:i w:val="0"/>
+                <w:sz w:val="21"/>
+              </w:rPr>
+              <w:t>Delivered remote assistance to users experiencing technical difficulties.</w:t>
+            </w:r>
+          </w:p>
+          <w:p>
+            <w:pPr>
+              <w:pStyle w:val="ListBullet"/>
+              <w:spacing w:before="0" w:after="0" w:line="240" w:lineRule="auto"/>
+              <w:ind w:left="317" w:hanging="230"/>
+            </w:pPr>
+            <w:r>
+              <w:rPr>
+                <w:rFonts w:ascii="Calibri" w:hAnsi="Calibri"/>
+                <w:b w:val="0"/>
+                <w:i w:val="0"/>
+                <w:sz w:val="21"/>
+              </w:rPr>
+              <w:t>Performed network troubleshooting to resolve connectivity issues.</w:t>
+            </w:r>
+          </w:p>
+        </w:tc>
+      </w:tr>
+    </w:tbl>
     <w:p>
       <w:pPr>
-        <w:pStyle w:val="ListBullet"/>
-        <w:spacing w:before="0" w:after="0" w:line="240" w:lineRule="auto"/>
-        <w:ind w:left="360" w:hanging="230"/>
+        <w:spacing w:after="0" w:before="0" w:line="220" w:lineRule="exact"/>
       </w:pPr>
-      <w:r>
-        <w:rPr>
-          <w:rFonts w:ascii="Calibri" w:hAnsi="Calibri"/>
-          <w:b w:val="0"/>
-          <w:i w:val="0"/>
-          <w:sz w:val="21"/>
-        </w:rPr>
-        <w:t>Configured printers for seamless integration with the SAPS domain.</w:t>
-      </w:r>
     </w:p>
+    <w:tbl>
+      <w:tblPr>
+        <w:tblW w:type="auto" w:w="0"/>
+        <w:jc w:val="left"/>
+        <w:tblLook w:firstColumn="1" w:firstRow="1" w:lastColumn="0" w:lastRow="0" w:noHBand="0" w:noVBand="1" w:val="04A0"/>
+        <w:tblBorders>
+          <w:top w:val="none" w:sz="0" w:space="0"/>
+          <w:left w:val="none" w:sz="0" w:space="0"/>
+          <w:bottom w:val="none" w:sz="0" w:space="0"/>
+          <w:right w:val="none" w:sz="0" w:space="0"/>
+          <w:insideH w:val="none" w:sz="0" w:space="0"/>
+          <w:insideV w:val="none" w:sz="0" w:space="0"/>
+        </w:tblBorders>
+        <w:tblLayout w:type="fixed"/>
+      </w:tblPr>
+      <w:tblGrid>
+        <w:gridCol w:w="5256"/>
+        <w:gridCol w:w="5256"/>
+      </w:tblGrid>
+      <w:tr>
+        <w:tc>
+          <w:tcPr>
+            <w:tcW w:type="dxa" w:w="1800"/>
+            <w:tcMar>
+              <w:top w:w="0" w:type="dxa"/>
+              <w:left w:w="0" w:type="dxa"/>
+              <w:bottom w:w="0" w:type="dxa"/>
+              <w:right w:w="120" w:type="dxa"/>
+            </w:tcMar>
+            <w:vAlign w:val="top"/>
+          </w:tcPr>
+          <w:p>
+            <w:pPr>
+              <w:spacing w:before="20"/>
+            </w:pPr>
+            <w:r>
+              <w:rPr>
+                <w:rFonts w:ascii="Calibri" w:hAnsi="Calibri"/>
+                <w:b w:val="0"/>
+                <w:i w:val="0"/>
+                <w:color w:val="555555"/>
+                <w:sz w:val="19"/>
+              </w:rPr>
+              <w:t>10/2008 – 03/2012</w:t>
+            </w:r>
+          </w:p>
+        </w:tc>
+        <w:tc>
+          <w:tcPr>
+            <w:tcW w:type="dxa" w:w="8712"/>
+            <w:tcMar>
+              <w:top w:w="0" w:type="dxa"/>
+              <w:left w:w="0" w:type="dxa"/>
+              <w:bottom w:w="0" w:type="dxa"/>
+              <w:right w:w="0" w:type="dxa"/>
+            </w:tcMar>
+            <w:vAlign w:val="top"/>
+          </w:tcPr>
+          <w:p>
+            <w:pPr>
+              <w:spacing w:after="0"/>
+            </w:pPr>
+            <w:r>
+              <w:rPr>
+                <w:rFonts w:ascii="Calibri" w:hAnsi="Calibri"/>
+                <w:b/>
+                <w:i w:val="0"/>
+                <w:sz w:val="21"/>
+              </w:rPr>
+              <w:t>Gijima Technologies  |  Pretoria</w:t>
+            </w:r>
+          </w:p>
+          <w:p>
+            <w:pPr>
+              <w:spacing w:after="0"/>
+            </w:pPr>
+            <w:r>
+              <w:rPr>
+                <w:rFonts w:ascii="Calibri" w:hAnsi="Calibri"/>
+                <w:b w:val="0"/>
+                <w:i w:val="0"/>
+                <w:sz w:val="21"/>
+              </w:rPr>
+              <w:t>Senior Field Service Engineer</w:t>
+            </w:r>
+          </w:p>
+          <w:p>
+            <w:pPr>
+              <w:pStyle w:val="ListBullet"/>
+              <w:spacing w:before="0" w:after="0" w:line="240" w:lineRule="auto"/>
+              <w:ind w:left="317" w:hanging="230"/>
+            </w:pPr>
+            <w:r>
+              <w:rPr>
+                <w:rFonts w:ascii="Calibri" w:hAnsi="Calibri"/>
+                <w:b w:val="0"/>
+                <w:i w:val="0"/>
+                <w:sz w:val="21"/>
+              </w:rPr>
+              <w:t>Delivered comprehensive desktop support services to a diverse user base.</w:t>
+            </w:r>
+          </w:p>
+          <w:p>
+            <w:pPr>
+              <w:pStyle w:val="ListBullet"/>
+              <w:spacing w:before="0" w:after="0" w:line="240" w:lineRule="auto"/>
+              <w:ind w:left="317" w:hanging="230"/>
+            </w:pPr>
+            <w:r>
+              <w:rPr>
+                <w:rFonts w:ascii="Calibri" w:hAnsi="Calibri"/>
+                <w:b w:val="0"/>
+                <w:i w:val="0"/>
+                <w:sz w:val="21"/>
+              </w:rPr>
+              <w:t>Managed printer support and repair, minimizing downtime.</w:t>
+            </w:r>
+          </w:p>
+          <w:p>
+            <w:pPr>
+              <w:pStyle w:val="ListBullet"/>
+              <w:spacing w:before="0" w:after="0" w:line="240" w:lineRule="auto"/>
+              <w:ind w:left="317" w:hanging="230"/>
+            </w:pPr>
+            <w:r>
+              <w:rPr>
+                <w:rFonts w:ascii="Calibri" w:hAnsi="Calibri"/>
+                <w:b w:val="0"/>
+                <w:i w:val="0"/>
+                <w:sz w:val="21"/>
+              </w:rPr>
+              <w:t>Provided software support and troubleshooting for various applications.</w:t>
+            </w:r>
+          </w:p>
+          <w:p>
+            <w:pPr>
+              <w:pStyle w:val="ListBullet"/>
+              <w:spacing w:before="0" w:after="0" w:line="240" w:lineRule="auto"/>
+              <w:ind w:left="317" w:hanging="230"/>
+            </w:pPr>
+            <w:r>
+              <w:rPr>
+                <w:rFonts w:ascii="Calibri" w:hAnsi="Calibri"/>
+                <w:b w:val="0"/>
+                <w:i w:val="0"/>
+                <w:sz w:val="21"/>
+              </w:rPr>
+              <w:t>Supported the BAS application for the Office of the Premier in Limpopo.</w:t>
+            </w:r>
+          </w:p>
+          <w:p>
+            <w:pPr>
+              <w:pStyle w:val="ListBullet"/>
+              <w:spacing w:before="0" w:after="0" w:line="240" w:lineRule="auto"/>
+              <w:ind w:left="317" w:hanging="230"/>
+            </w:pPr>
+            <w:r>
+              <w:rPr>
+                <w:rFonts w:ascii="Calibri" w:hAnsi="Calibri"/>
+                <w:b w:val="0"/>
+                <w:i w:val="0"/>
+                <w:sz w:val="21"/>
+              </w:rPr>
+              <w:t>Acted as Client Account Champion, serving as the Technical Support Specialist for the Office of the Premier.</w:t>
+            </w:r>
+          </w:p>
+          <w:p>
+            <w:pPr>
+              <w:pStyle w:val="ListBullet"/>
+              <w:spacing w:before="0" w:after="0" w:line="240" w:lineRule="auto"/>
+              <w:ind w:left="317" w:hanging="230"/>
+            </w:pPr>
+            <w:r>
+              <w:rPr>
+                <w:rFonts w:ascii="Calibri" w:hAnsi="Calibri"/>
+                <w:b w:val="0"/>
+                <w:i w:val="0"/>
+                <w:sz w:val="21"/>
+              </w:rPr>
+              <w:t>Contributed to technical projects for key clients including South African Police Services, Capitec Bank, Office of the Premier (Limpopo Province), ABSA Bank, Ackermans, and Sanlam.</w:t>
+            </w:r>
+          </w:p>
+        </w:tc>
+      </w:tr>
+    </w:tbl>
     <w:p>
       <w:pPr>
-        <w:pStyle w:val="ListBullet"/>
-        <w:spacing w:before="0" w:after="0" w:line="240" w:lineRule="auto"/>
-        <w:ind w:left="360" w:hanging="230"/>
+        <w:spacing w:after="0" w:before="0" w:line="220" w:lineRule="exact"/>
       </w:pPr>
-      <w:r>
-        <w:rPr>
-          <w:rFonts w:ascii="Calibri" w:hAnsi="Calibri"/>
-          <w:b w:val="0"/>
-          <w:i w:val="0"/>
-          <w:sz w:val="21"/>
-        </w:rPr>
-        <w:t>Administered network configurations to ensure optimal connectivity.</w:t>
-      </w:r>
     </w:p>
+    <w:tbl>
+      <w:tblPr>
+        <w:tblW w:type="auto" w:w="0"/>
+        <w:jc w:val="left"/>
+        <w:tblLook w:firstColumn="1" w:firstRow="1" w:lastColumn="0" w:lastRow="0" w:noHBand="0" w:noVBand="1" w:val="04A0"/>
+        <w:tblBorders>
+          <w:top w:val="none" w:sz="0" w:space="0"/>
+          <w:left w:val="none" w:sz="0" w:space="0"/>
+          <w:bottom w:val="none" w:sz="0" w:space="0"/>
+          <w:right w:val="none" w:sz="0" w:space="0"/>
+          <w:insideH w:val="none" w:sz="0" w:space="0"/>
+          <w:insideV w:val="none" w:sz="0" w:space="0"/>
+        </w:tblBorders>
+        <w:tblLayout w:type="fixed"/>
+      </w:tblPr>
+      <w:tblGrid>
+        <w:gridCol w:w="5256"/>
+        <w:gridCol w:w="5256"/>
+      </w:tblGrid>
+      <w:tr>
+        <w:tc>
+          <w:tcPr>
+            <w:tcW w:type="dxa" w:w="1800"/>
+            <w:tcMar>
+              <w:top w:w="0" w:type="dxa"/>
+              <w:left w:w="0" w:type="dxa"/>
+              <w:bottom w:w="0" w:type="dxa"/>
+              <w:right w:w="120" w:type="dxa"/>
+            </w:tcMar>
+            <w:vAlign w:val="top"/>
+          </w:tcPr>
+          <w:p>
+            <w:pPr>
+              <w:spacing w:before="20"/>
+            </w:pPr>
+            <w:r>
+              <w:rPr>
+                <w:rFonts w:ascii="Calibri" w:hAnsi="Calibri"/>
+                <w:b w:val="0"/>
+                <w:i w:val="0"/>
+                <w:color w:val="555555"/>
+                <w:sz w:val="19"/>
+              </w:rPr>
+              <w:t>10/2007 – 10/2008</w:t>
+            </w:r>
+          </w:p>
+        </w:tc>
+        <w:tc>
+          <w:tcPr>
+            <w:tcW w:type="dxa" w:w="8712"/>
+            <w:tcMar>
+              <w:top w:w="0" w:type="dxa"/>
+              <w:left w:w="0" w:type="dxa"/>
+              <w:bottom w:w="0" w:type="dxa"/>
+              <w:right w:w="0" w:type="dxa"/>
+            </w:tcMar>
+            <w:vAlign w:val="top"/>
+          </w:tcPr>
+          <w:p>
+            <w:pPr>
+              <w:spacing w:after="0"/>
+            </w:pPr>
+            <w:r>
+              <w:rPr>
+                <w:rFonts w:ascii="Calibri" w:hAnsi="Calibri"/>
+                <w:b/>
+                <w:i w:val="0"/>
+                <w:sz w:val="21"/>
+              </w:rPr>
+              <w:t>Sizwe IT Group  |  Pretoria</w:t>
+            </w:r>
+          </w:p>
+          <w:p>
+            <w:pPr>
+              <w:spacing w:after="0"/>
+            </w:pPr>
+            <w:r>
+              <w:rPr>
+                <w:rFonts w:ascii="Calibri" w:hAnsi="Calibri"/>
+                <w:b w:val="0"/>
+                <w:i w:val="0"/>
+                <w:sz w:val="21"/>
+              </w:rPr>
+              <w:t>Senior Field Service Engineer</w:t>
+            </w:r>
+          </w:p>
+          <w:p>
+            <w:pPr>
+              <w:pStyle w:val="ListBullet"/>
+              <w:spacing w:before="0" w:after="0" w:line="240" w:lineRule="auto"/>
+              <w:ind w:left="317" w:hanging="230"/>
+            </w:pPr>
+            <w:r>
+              <w:rPr>
+                <w:rFonts w:ascii="Calibri" w:hAnsi="Calibri"/>
+                <w:b w:val="0"/>
+                <w:i w:val="0"/>
+                <w:sz w:val="21"/>
+              </w:rPr>
+              <w:t>Rendered desktop support services, addressing hardware and software issues.</w:t>
+            </w:r>
+          </w:p>
+          <w:p>
+            <w:pPr>
+              <w:pStyle w:val="ListBullet"/>
+              <w:spacing w:before="0" w:after="0" w:line="240" w:lineRule="auto"/>
+              <w:ind w:left="317" w:hanging="230"/>
+            </w:pPr>
+            <w:r>
+              <w:rPr>
+                <w:rFonts w:ascii="Calibri" w:hAnsi="Calibri"/>
+                <w:b w:val="0"/>
+                <w:i w:val="0"/>
+                <w:sz w:val="21"/>
+              </w:rPr>
+              <w:t>Handled printer support and repairs, ensuring operational efficiency.</w:t>
+            </w:r>
+          </w:p>
+          <w:p>
+            <w:pPr>
+              <w:pStyle w:val="ListBullet"/>
+              <w:spacing w:before="0" w:after="0" w:line="240" w:lineRule="auto"/>
+              <w:ind w:left="317" w:hanging="230"/>
+            </w:pPr>
+            <w:r>
+              <w:rPr>
+                <w:rFonts w:ascii="Calibri" w:hAnsi="Calibri"/>
+                <w:b w:val="0"/>
+                <w:i w:val="0"/>
+                <w:sz w:val="21"/>
+              </w:rPr>
+              <w:t>Provided software support and troubleshooting across multiple platforms.</w:t>
+            </w:r>
+          </w:p>
+          <w:p>
+            <w:pPr>
+              <w:pStyle w:val="ListBullet"/>
+              <w:spacing w:before="0" w:after="0" w:line="240" w:lineRule="auto"/>
+              <w:ind w:left="317" w:hanging="230"/>
+            </w:pPr>
+            <w:r>
+              <w:rPr>
+                <w:rFonts w:ascii="Calibri" w:hAnsi="Calibri"/>
+                <w:b w:val="0"/>
+                <w:i w:val="0"/>
+                <w:sz w:val="21"/>
+              </w:rPr>
+              <w:t>Supported the BAS application for the Office of the Premier in Limpopo.</w:t>
+            </w:r>
+          </w:p>
+          <w:p>
+            <w:pPr>
+              <w:pStyle w:val="ListBullet"/>
+              <w:spacing w:before="0" w:after="0" w:line="240" w:lineRule="auto"/>
+              <w:ind w:left="317" w:hanging="230"/>
+            </w:pPr>
+            <w:r>
+              <w:rPr>
+                <w:rFonts w:ascii="Calibri" w:hAnsi="Calibri"/>
+                <w:b w:val="0"/>
+                <w:i w:val="0"/>
+                <w:sz w:val="21"/>
+              </w:rPr>
+              <w:t>Served as Client Account Champion and Technical Support Specialist for the Office of the Premier.</w:t>
+            </w:r>
+          </w:p>
+          <w:p>
+            <w:pPr>
+              <w:pStyle w:val="ListBullet"/>
+              <w:spacing w:before="0" w:after="0" w:line="240" w:lineRule="auto"/>
+              <w:ind w:left="317" w:hanging="230"/>
+            </w:pPr>
+            <w:r>
+              <w:rPr>
+                <w:rFonts w:ascii="Calibri" w:hAnsi="Calibri"/>
+                <w:b w:val="0"/>
+                <w:i w:val="0"/>
+                <w:sz w:val="21"/>
+              </w:rPr>
+              <w:t>Participated in technical projects for notable clients: South African Police Services, Capitec Bank, Office of the Premier (Limpopo Province), ABSA Bank, Ackermans, and Sanlam.</w:t>
+            </w:r>
+          </w:p>
+        </w:tc>
+      </w:tr>
+    </w:tbl>
     <w:p>
       <w:pPr>
-        <w:pStyle w:val="ListBullet"/>
-        <w:spacing w:before="0" w:after="0" w:line="240" w:lineRule="auto"/>
-        <w:ind w:left="360" w:hanging="230"/>
+        <w:spacing w:after="0" w:before="0" w:line="220" w:lineRule="exact"/>
       </w:pPr>
-      <w:r>
-        <w:rPr>
-          <w:rFonts w:ascii="Calibri" w:hAnsi="Calibri"/>
-          <w:b w:val="0"/>
-          <w:i w:val="0"/>
-          <w:sz w:val="21"/>
-        </w:rPr>
-        <w:t>Managed mainframe configurations and operational readiness.</w:t>
-      </w:r>
     </w:p>
+    <w:tbl>
+      <w:tblPr>
+        <w:tblW w:type="auto" w:w="0"/>
+        <w:jc w:val="left"/>
+        <w:tblLook w:firstColumn="1" w:firstRow="1" w:lastColumn="0" w:lastRow="0" w:noHBand="0" w:noVBand="1" w:val="04A0"/>
+        <w:tblBorders>
+          <w:top w:val="none" w:sz="0" w:space="0"/>
+          <w:left w:val="none" w:sz="0" w:space="0"/>
+          <w:bottom w:val="none" w:sz="0" w:space="0"/>
+          <w:right w:val="none" w:sz="0" w:space="0"/>
+          <w:insideH w:val="none" w:sz="0" w:space="0"/>
+          <w:insideV w:val="none" w:sz="0" w:space="0"/>
+        </w:tblBorders>
+        <w:tblLayout w:type="fixed"/>
+      </w:tblPr>
+      <w:tblGrid>
+        <w:gridCol w:w="5256"/>
+        <w:gridCol w:w="5256"/>
+      </w:tblGrid>
+      <w:tr>
+        <w:tc>
+          <w:tcPr>
+            <w:tcW w:type="dxa" w:w="1800"/>
+            <w:tcMar>
+              <w:top w:w="0" w:type="dxa"/>
+              <w:left w:w="0" w:type="dxa"/>
+              <w:bottom w:w="0" w:type="dxa"/>
+              <w:right w:w="120" w:type="dxa"/>
+            </w:tcMar>
+            <w:vAlign w:val="top"/>
+          </w:tcPr>
+          <w:p>
+            <w:pPr>
+              <w:spacing w:before="20"/>
+            </w:pPr>
+            <w:r>
+              <w:rPr>
+                <w:rFonts w:ascii="Calibri" w:hAnsi="Calibri"/>
+                <w:b w:val="0"/>
+                <w:i w:val="0"/>
+                <w:color w:val="555555"/>
+                <w:sz w:val="19"/>
+              </w:rPr>
+              <w:t>10/2003 – 09/2007</w:t>
+            </w:r>
+          </w:p>
+        </w:tc>
+        <w:tc>
+          <w:tcPr>
+            <w:tcW w:type="dxa" w:w="8712"/>
+            <w:tcMar>
+              <w:top w:w="0" w:type="dxa"/>
+              <w:left w:w="0" w:type="dxa"/>
+              <w:bottom w:w="0" w:type="dxa"/>
+              <w:right w:w="0" w:type="dxa"/>
+            </w:tcMar>
+            <w:vAlign w:val="top"/>
+          </w:tcPr>
+          <w:p>
+            <w:pPr>
+              <w:spacing w:after="0"/>
+            </w:pPr>
+            <w:r>
+              <w:rPr>
+                <w:rFonts w:ascii="Calibri" w:hAnsi="Calibri"/>
+                <w:b/>
+                <w:i w:val="0"/>
+                <w:sz w:val="21"/>
+              </w:rPr>
+              <w:t>Tasima  |  Pretoria</w:t>
+            </w:r>
+          </w:p>
+          <w:p>
+            <w:pPr>
+              <w:spacing w:after="0"/>
+            </w:pPr>
+            <w:r>
+              <w:rPr>
+                <w:rFonts w:ascii="Calibri" w:hAnsi="Calibri"/>
+                <w:b w:val="0"/>
+                <w:i w:val="0"/>
+                <w:sz w:val="21"/>
+              </w:rPr>
+              <w:t>Desktop Support</w:t>
+            </w:r>
+          </w:p>
+          <w:p>
+            <w:pPr>
+              <w:pStyle w:val="ListBullet"/>
+              <w:spacing w:before="0" w:after="0" w:line="240" w:lineRule="auto"/>
+              <w:ind w:left="317" w:hanging="230"/>
+            </w:pPr>
+            <w:r>
+              <w:rPr>
+                <w:rFonts w:ascii="Calibri" w:hAnsi="Calibri"/>
+                <w:b w:val="0"/>
+                <w:i w:val="0"/>
+                <w:sz w:val="21"/>
+              </w:rPr>
+              <w:t>Provided eNaTIS software and hardware support, ensuring system functionality.</w:t>
+            </w:r>
+          </w:p>
+          <w:p>
+            <w:pPr>
+              <w:pStyle w:val="ListBullet"/>
+              <w:spacing w:before="0" w:after="0" w:line="240" w:lineRule="auto"/>
+              <w:ind w:left="317" w:hanging="230"/>
+            </w:pPr>
+            <w:r>
+              <w:rPr>
+                <w:rFonts w:ascii="Calibri" w:hAnsi="Calibri"/>
+                <w:b w:val="0"/>
+                <w:i w:val="0"/>
+                <w:sz w:val="21"/>
+              </w:rPr>
+              <w:t>Conducted site audits to assess and document IT infrastructure.</w:t>
+            </w:r>
+          </w:p>
+          <w:p>
+            <w:pPr>
+              <w:pStyle w:val="ListBullet"/>
+              <w:spacing w:before="0" w:after="0" w:line="240" w:lineRule="auto"/>
+              <w:ind w:left="317" w:hanging="230"/>
+            </w:pPr>
+            <w:r>
+              <w:rPr>
+                <w:rFonts w:ascii="Calibri" w:hAnsi="Calibri"/>
+                <w:b w:val="0"/>
+                <w:i w:val="0"/>
+                <w:sz w:val="21"/>
+              </w:rPr>
+              <w:t>Delivered technical support for the eNaTIS system, resolving user issues.</w:t>
+            </w:r>
+          </w:p>
+          <w:p>
+            <w:pPr>
+              <w:pStyle w:val="ListBullet"/>
+              <w:spacing w:before="0" w:after="0" w:line="240" w:lineRule="auto"/>
+              <w:ind w:left="317" w:hanging="230"/>
+            </w:pPr>
+            <w:r>
+              <w:rPr>
+                <w:rFonts w:ascii="Calibri" w:hAnsi="Calibri"/>
+                <w:b w:val="0"/>
+                <w:i w:val="0"/>
+                <w:sz w:val="21"/>
+              </w:rPr>
+              <w:t>Performed job quality checks post-deployment to verify successful installations.</w:t>
+            </w:r>
+          </w:p>
+          <w:p>
+            <w:pPr>
+              <w:pStyle w:val="ListBullet"/>
+              <w:spacing w:before="0" w:after="0" w:line="240" w:lineRule="auto"/>
+              <w:ind w:left="317" w:hanging="230"/>
+            </w:pPr>
+            <w:r>
+              <w:rPr>
+                <w:rFonts w:ascii="Calibri" w:hAnsi="Calibri"/>
+                <w:b w:val="0"/>
+                <w:i w:val="0"/>
+                <w:sz w:val="21"/>
+              </w:rPr>
+              <w:t>Managed technical teams, overseeing daily operations and task allocation.</w:t>
+            </w:r>
+          </w:p>
+          <w:p>
+            <w:pPr>
+              <w:pStyle w:val="ListBullet"/>
+              <w:spacing w:before="0" w:after="0" w:line="240" w:lineRule="auto"/>
+              <w:ind w:left="317" w:hanging="230"/>
+            </w:pPr>
+            <w:r>
+              <w:rPr>
+                <w:rFonts w:ascii="Calibri" w:hAnsi="Calibri"/>
+                <w:b w:val="0"/>
+                <w:i w:val="0"/>
+                <w:sz w:val="21"/>
+              </w:rPr>
+              <w:t>Undertook extensive fieldwork to support clients across various locations.</w:t>
+            </w:r>
+          </w:p>
+          <w:p>
+            <w:pPr>
+              <w:pStyle w:val="ListBullet"/>
+              <w:spacing w:before="0" w:after="0" w:line="240" w:lineRule="auto"/>
+              <w:ind w:left="317" w:hanging="230"/>
+            </w:pPr>
+            <w:r>
+              <w:rPr>
+                <w:rFonts w:ascii="Calibri" w:hAnsi="Calibri"/>
+                <w:b w:val="0"/>
+                <w:i w:val="0"/>
+                <w:sz w:val="21"/>
+              </w:rPr>
+              <w:t>Directed software deployment projects on a national scale.</w:t>
+            </w:r>
+          </w:p>
+          <w:p>
+            <w:pPr>
+              <w:pStyle w:val="ListBullet"/>
+              <w:spacing w:before="0" w:after="0" w:line="240" w:lineRule="auto"/>
+              <w:ind w:left="317" w:hanging="230"/>
+            </w:pPr>
+            <w:r>
+              <w:rPr>
+                <w:rFonts w:ascii="Calibri" w:hAnsi="Calibri"/>
+                <w:b w:val="0"/>
+                <w:i w:val="0"/>
+                <w:sz w:val="21"/>
+              </w:rPr>
+              <w:t>Offered desktop support, troubleshooting user hardware and software problems.</w:t>
+            </w:r>
+          </w:p>
+          <w:p>
+            <w:pPr>
+              <w:pStyle w:val="ListBullet"/>
+              <w:spacing w:before="0" w:after="0" w:line="240" w:lineRule="auto"/>
+              <w:ind w:left="317" w:hanging="230"/>
+            </w:pPr>
+            <w:r>
+              <w:rPr>
+                <w:rFonts w:ascii="Calibri" w:hAnsi="Calibri"/>
+                <w:b w:val="0"/>
+                <w:i w:val="0"/>
+                <w:sz w:val="21"/>
+              </w:rPr>
+              <w:t>Provided in-house application support for Barclays Bank systems.</w:t>
+            </w:r>
+          </w:p>
+          <w:p>
+            <w:pPr>
+              <w:pStyle w:val="ListBullet"/>
+              <w:spacing w:before="0" w:after="0" w:line="240" w:lineRule="auto"/>
+              <w:ind w:left="317" w:hanging="230"/>
+            </w:pPr>
+            <w:r>
+              <w:rPr>
+                <w:rFonts w:ascii="Calibri" w:hAnsi="Calibri"/>
+                <w:b w:val="0"/>
+                <w:i w:val="0"/>
+                <w:sz w:val="21"/>
+              </w:rPr>
+              <w:t>Configured 3G modems for mobile connectivity.</w:t>
+            </w:r>
+          </w:p>
+          <w:p>
+            <w:pPr>
+              <w:pStyle w:val="ListBullet"/>
+              <w:spacing w:before="0" w:after="0" w:line="240" w:lineRule="auto"/>
+              <w:ind w:left="317" w:hanging="230"/>
+            </w:pPr>
+            <w:r>
+              <w:rPr>
+                <w:rFonts w:ascii="Calibri" w:hAnsi="Calibri"/>
+                <w:b w:val="0"/>
+                <w:i w:val="0"/>
+                <w:sz w:val="21"/>
+              </w:rPr>
+              <w:t>Administered and supported Citrix environments.</w:t>
+            </w:r>
+          </w:p>
+          <w:p>
+            <w:pPr>
+              <w:pStyle w:val="ListBullet"/>
+              <w:spacing w:before="0" w:after="0" w:line="240" w:lineRule="auto"/>
+              <w:ind w:left="317" w:hanging="230"/>
+            </w:pPr>
+            <w:r>
+              <w:rPr>
+                <w:rFonts w:ascii="Calibri" w:hAnsi="Calibri"/>
+                <w:b w:val="0"/>
+                <w:i w:val="0"/>
+                <w:sz w:val="21"/>
+              </w:rPr>
+              <w:t>Repaired HP and Lenovo laptops, restoring functionality.</w:t>
+            </w:r>
+          </w:p>
+          <w:p>
+            <w:pPr>
+              <w:pStyle w:val="ListBullet"/>
+              <w:spacing w:before="0" w:after="0" w:line="240" w:lineRule="auto"/>
+              <w:ind w:left="317" w:hanging="230"/>
+            </w:pPr>
+            <w:r>
+              <w:rPr>
+                <w:rFonts w:ascii="Calibri" w:hAnsi="Calibri"/>
+                <w:b w:val="0"/>
+                <w:i w:val="0"/>
+                <w:sz w:val="21"/>
+              </w:rPr>
+              <w:t>Set up Cisco IP phones for new client installations.</w:t>
+            </w:r>
+          </w:p>
+          <w:p>
+            <w:pPr>
+              <w:pStyle w:val="ListBullet"/>
+              <w:spacing w:before="0" w:after="0" w:line="240" w:lineRule="auto"/>
+              <w:ind w:left="317" w:hanging="230"/>
+            </w:pPr>
+            <w:r>
+              <w:rPr>
+                <w:rFonts w:ascii="Calibri" w:hAnsi="Calibri"/>
+                <w:b w:val="0"/>
+                <w:i w:val="0"/>
+                <w:sz w:val="21"/>
+              </w:rPr>
+              <w:t>Configured Microsoft Outlook for new users, facilitating email access.</w:t>
+            </w:r>
+          </w:p>
+        </w:tc>
+      </w:tr>
+    </w:tbl>
     <w:p>
       <w:pPr>
-        <w:pStyle w:val="ListBullet"/>
-        <w:spacing w:before="0" w:after="0" w:line="240" w:lineRule="auto"/>
-        <w:ind w:left="360" w:hanging="230"/>
-      </w:pPr>
-      <w:r>
-        <w:rPr>
-          <w:rFonts w:ascii="Calibri" w:hAnsi="Calibri"/>
-          <w:b w:val="0"/>
-          <w:i w:val="0"/>
-          <w:sz w:val="21"/>
-        </w:rPr>
-        <w:t>Oversaw SAPS domain configurations, maintaining system integrity.</w:t>
-      </w:r>
-    </w:p>
-    <w:p>
-      <w:pPr>
-        <w:pStyle w:val="ListBullet"/>
-        <w:spacing w:before="0" w:after="0" w:line="240" w:lineRule="auto"/>
-        <w:ind w:left="360" w:hanging="230"/>
-      </w:pPr>
-      <w:r>
-        <w:rPr>
-          <w:rFonts w:ascii="Calibri" w:hAnsi="Calibri"/>
-          <w:b w:val="0"/>
-          <w:i w:val="0"/>
-          <w:sz w:val="21"/>
-        </w:rPr>
-        <w:t>Set up and managed email accounts and systems for end-users.</w:t>
-      </w:r>
-    </w:p>
-    <w:p>
-      <w:pPr>
-        <w:pStyle w:val="ListBullet"/>
-        <w:spacing w:before="0" w:after="0" w:line="240" w:lineRule="auto"/>
-        <w:ind w:left="360" w:hanging="230"/>
-      </w:pPr>
-      <w:r>
-        <w:rPr>
-          <w:rFonts w:ascii="Calibri" w:hAnsi="Calibri"/>
-          <w:b w:val="0"/>
-          <w:i w:val="0"/>
-          <w:sz w:val="21"/>
-        </w:rPr>
-        <w:t>Utilised Active Directory for user management and access control.</w:t>
-      </w:r>
-    </w:p>
-    <w:p>
-      <w:pPr>
-        <w:pStyle w:val="ListBullet"/>
-        <w:spacing w:before="0" w:after="0" w:line="240" w:lineRule="auto"/>
-        <w:ind w:left="360" w:hanging="230"/>
-      </w:pPr>
-      <w:r>
-        <w:rPr>
-          <w:rFonts w:ascii="Calibri" w:hAnsi="Calibri"/>
-          <w:b w:val="0"/>
-          <w:i w:val="0"/>
-          <w:sz w:val="21"/>
-        </w:rPr>
-        <w:t>Resolved support tickets within Service Level Agreements (SLAs).</w:t>
-      </w:r>
-    </w:p>
-    <w:p>
-      <w:pPr>
-        <w:tabs>
-          <w:tab w:pos="10512" w:val="right"/>
-        </w:tabs>
-        <w:spacing w:before="120"/>
-      </w:pPr>
-      <w:r>
-        <w:rPr>
-          <w:rFonts w:ascii="Calibri" w:hAnsi="Calibri"/>
-          <w:b/>
-          <w:i w:val="0"/>
-          <w:sz w:val="21"/>
-        </w:rPr>
-        <w:t>Sizwe IT Group  |  Pretoria</w:t>
-      </w:r>
-    </w:p>
-    <w:p>
-      <w:pPr>
-        <w:tabs>
-          <w:tab w:pos="10512" w:val="right"/>
-        </w:tabs>
-        <w:spacing w:before="0"/>
-      </w:pPr>
-      <w:r>
-        <w:rPr>
-          <w:rFonts w:ascii="Calibri" w:hAnsi="Calibri"/>
-          <w:b w:val="0"/>
-          <w:i w:val="0"/>
-          <w:sz w:val="21"/>
-        </w:rPr>
-        <w:t>Migration Consultant</w:t>
-      </w:r>
-      <w:r>
-        <w:rPr>
-          <w:rFonts w:ascii="Calibri" w:hAnsi="Calibri"/>
-          <w:b w:val="0"/>
-          <w:i w:val="0"/>
-          <w:sz w:val="21"/>
-        </w:rPr>
-        <w:tab/>
-        <w:t>02/2018 – 10/2019</w:t>
-      </w:r>
-    </w:p>
-    <w:p>
-      <w:pPr>
-        <w:pStyle w:val="ListBullet"/>
-        <w:spacing w:before="0" w:after="0" w:line="240" w:lineRule="auto"/>
-        <w:ind w:left="360" w:hanging="230"/>
-      </w:pPr>
-      <w:r>
-        <w:rPr>
-          <w:rFonts w:ascii="Calibri" w:hAnsi="Calibri"/>
-          <w:b w:val="0"/>
-          <w:i w:val="0"/>
-          <w:sz w:val="21"/>
-        </w:rPr>
-        <w:t>Executed mailbox migrations between Exchange 2013/2016 and Office 365 environments.</w:t>
-      </w:r>
-    </w:p>
-    <w:p>
-      <w:pPr>
-        <w:pStyle w:val="ListBullet"/>
-        <w:spacing w:before="0" w:after="0" w:line="240" w:lineRule="auto"/>
-        <w:ind w:left="360" w:hanging="230"/>
-      </w:pPr>
-      <w:r>
-        <w:rPr>
-          <w:rFonts w:ascii="Calibri" w:hAnsi="Calibri"/>
-          <w:b w:val="0"/>
-          <w:i w:val="0"/>
-          <w:sz w:val="21"/>
-        </w:rPr>
-        <w:t>Provided post-migration deployment and support, ensuring smooth transitions for users.</w:t>
-      </w:r>
-    </w:p>
-    <w:p>
-      <w:pPr>
-        <w:pStyle w:val="ListBullet"/>
-        <w:spacing w:before="0" w:after="0" w:line="240" w:lineRule="auto"/>
-        <w:ind w:left="360" w:hanging="230"/>
-      </w:pPr>
-      <w:r>
-        <w:rPr>
-          <w:rFonts w:ascii="Calibri" w:hAnsi="Calibri"/>
-          <w:b w:val="0"/>
-          <w:i w:val="0"/>
-          <w:sz w:val="21"/>
-        </w:rPr>
-        <w:t>Delivered 3rd line support for Exchange and Active Directory user roles.</w:t>
-      </w:r>
-    </w:p>
-    <w:p>
-      <w:pPr>
-        <w:pStyle w:val="ListBullet"/>
-        <w:spacing w:before="0" w:after="0" w:line="240" w:lineRule="auto"/>
-        <w:ind w:left="360" w:hanging="230"/>
-      </w:pPr>
-      <w:r>
-        <w:rPr>
-          <w:rFonts w:ascii="Calibri" w:hAnsi="Calibri"/>
-          <w:b w:val="0"/>
-          <w:i w:val="0"/>
-          <w:sz w:val="21"/>
-        </w:rPr>
-        <w:t>Managed request and service fulfillment for messaging systems.</w:t>
-      </w:r>
-    </w:p>
-    <w:p>
-      <w:pPr>
-        <w:pStyle w:val="ListBullet"/>
-        <w:spacing w:before="0" w:after="0" w:line="240" w:lineRule="auto"/>
-        <w:ind w:left="360" w:hanging="230"/>
-      </w:pPr>
-      <w:r>
-        <w:rPr>
-          <w:rFonts w:ascii="Calibri" w:hAnsi="Calibri"/>
-          <w:b w:val="0"/>
-          <w:i w:val="0"/>
-          <w:sz w:val="21"/>
-        </w:rPr>
-        <w:t>Implemented and supported Mobile Device Management solutions including BlackBerry Work, Outlook Mobile, and Intune.</w:t>
-      </w:r>
-    </w:p>
-    <w:p>
-      <w:pPr>
-        <w:pStyle w:val="ListBullet"/>
-        <w:spacing w:before="0" w:after="0" w:line="240" w:lineRule="auto"/>
-        <w:ind w:left="360" w:hanging="230"/>
-      </w:pPr>
-      <w:r>
-        <w:rPr>
-          <w:rFonts w:ascii="Calibri" w:hAnsi="Calibri"/>
-          <w:b w:val="0"/>
-          <w:i w:val="0"/>
-          <w:sz w:val="21"/>
-        </w:rPr>
-        <w:t>Assumed ownership of unresolved support issues, escalating as necessary to senior teams.</w:t>
-      </w:r>
-    </w:p>
-    <w:p>
-      <w:pPr>
-        <w:pStyle w:val="ListBullet"/>
-        <w:spacing w:before="0" w:after="0" w:line="240" w:lineRule="auto"/>
-        <w:ind w:left="360" w:hanging="230"/>
-      </w:pPr>
-      <w:r>
-        <w:rPr>
-          <w:rFonts w:ascii="Calibri" w:hAnsi="Calibri"/>
-          <w:b w:val="0"/>
-          <w:i w:val="0"/>
-          <w:sz w:val="21"/>
-        </w:rPr>
-        <w:t>Authored Standard Operating Procedures for technicians, enhancing knowledge transfer.</w:t>
-      </w:r>
-    </w:p>
-    <w:p>
-      <w:pPr>
-        <w:pStyle w:val="ListBullet"/>
-        <w:spacing w:before="0" w:after="0" w:line="240" w:lineRule="auto"/>
-        <w:ind w:left="360" w:hanging="230"/>
-      </w:pPr>
-      <w:r>
-        <w:rPr>
-          <w:rFonts w:ascii="Calibri" w:hAnsi="Calibri"/>
-          <w:b w:val="0"/>
-          <w:i w:val="0"/>
-          <w:sz w:val="21"/>
-        </w:rPr>
-        <w:t>Adhered to established SLAs and Change Management schedules.</w:t>
-      </w:r>
-    </w:p>
-    <w:p>
-      <w:pPr>
-        <w:tabs>
-          <w:tab w:pos="10512" w:val="right"/>
-        </w:tabs>
-        <w:spacing w:before="120"/>
-      </w:pPr>
-      <w:r>
-        <w:rPr>
-          <w:rFonts w:ascii="Calibri" w:hAnsi="Calibri"/>
-          <w:b/>
-          <w:i w:val="0"/>
-          <w:sz w:val="21"/>
-        </w:rPr>
-        <w:t>Khauleza IT Solutions  |  Pretoria</w:t>
-      </w:r>
-    </w:p>
-    <w:p>
-      <w:pPr>
-        <w:tabs>
-          <w:tab w:pos="10512" w:val="right"/>
-        </w:tabs>
-        <w:spacing w:before="0"/>
-      </w:pPr>
-      <w:r>
-        <w:rPr>
-          <w:rFonts w:ascii="Calibri" w:hAnsi="Calibri"/>
-          <w:b w:val="0"/>
-          <w:i w:val="0"/>
-          <w:sz w:val="21"/>
-        </w:rPr>
-        <w:t>Senior Support Engineer</w:t>
-      </w:r>
-      <w:r>
-        <w:rPr>
-          <w:rFonts w:ascii="Calibri" w:hAnsi="Calibri"/>
-          <w:b w:val="0"/>
-          <w:i w:val="0"/>
-          <w:sz w:val="21"/>
-        </w:rPr>
-        <w:tab/>
-        <w:t>02/2017 – 01/2018</w:t>
-      </w:r>
-    </w:p>
-    <w:p>
-      <w:pPr>
-        <w:pStyle w:val="ListBullet"/>
-        <w:spacing w:before="0" w:after="0" w:line="240" w:lineRule="auto"/>
-        <w:ind w:left="360" w:hanging="230"/>
-      </w:pPr>
-      <w:r>
-        <w:rPr>
-          <w:rFonts w:ascii="Calibri" w:hAnsi="Calibri"/>
-          <w:b w:val="0"/>
-          <w:i w:val="0"/>
-          <w:sz w:val="21"/>
-        </w:rPr>
-        <w:t>Provided hardware and software maintenance for SAPS (Crime Intelligence, DPCI, Silverton Forensic, and Supply Chain Management).</w:t>
-      </w:r>
-    </w:p>
-    <w:p>
-      <w:pPr>
-        <w:pStyle w:val="ListBullet"/>
-        <w:spacing w:before="0" w:after="0" w:line="240" w:lineRule="auto"/>
-        <w:ind w:left="360" w:hanging="230"/>
-      </w:pPr>
-      <w:r>
-        <w:rPr>
-          <w:rFonts w:ascii="Calibri" w:hAnsi="Calibri"/>
-          <w:b w:val="0"/>
-          <w:i w:val="0"/>
-          <w:sz w:val="21"/>
-        </w:rPr>
-        <w:t>Repaired and configured Dell, Proline, Toshiba, and Lenovo laptops.</w:t>
-      </w:r>
-    </w:p>
-    <w:p>
-      <w:pPr>
-        <w:pStyle w:val="ListBullet"/>
-        <w:spacing w:before="0" w:after="0" w:line="240" w:lineRule="auto"/>
-        <w:ind w:left="360" w:hanging="230"/>
-      </w:pPr>
-      <w:r>
-        <w:rPr>
-          <w:rFonts w:ascii="Calibri" w:hAnsi="Calibri"/>
-          <w:b w:val="0"/>
-          <w:i w:val="0"/>
-          <w:sz w:val="21"/>
-        </w:rPr>
-        <w:t>Conducted root cause analysis on recurring technical problems to implement permanent solutions.</w:t>
-      </w:r>
-    </w:p>
-    <w:p>
-      <w:pPr>
-        <w:pStyle w:val="ListBullet"/>
-        <w:spacing w:before="0" w:after="0" w:line="240" w:lineRule="auto"/>
-        <w:ind w:left="360" w:hanging="230"/>
-      </w:pPr>
-      <w:r>
-        <w:rPr>
-          <w:rFonts w:ascii="Calibri" w:hAnsi="Calibri"/>
-          <w:b w:val="0"/>
-          <w:i w:val="0"/>
-          <w:sz w:val="21"/>
-        </w:rPr>
-        <w:t>Configured printers for deployment within the SAPS domain.</w:t>
-      </w:r>
-    </w:p>
-    <w:p>
-      <w:pPr>
-        <w:pStyle w:val="ListBullet"/>
-        <w:spacing w:before="0" w:after="0" w:line="240" w:lineRule="auto"/>
-        <w:ind w:left="360" w:hanging="230"/>
-      </w:pPr>
-      <w:r>
-        <w:rPr>
-          <w:rFonts w:ascii="Calibri" w:hAnsi="Calibri"/>
-          <w:b w:val="0"/>
-          <w:i w:val="0"/>
-          <w:sz w:val="21"/>
-        </w:rPr>
-        <w:t>Managed network configurations to ensure reliable connectivity.</w:t>
-      </w:r>
-    </w:p>
-    <w:p>
-      <w:pPr>
-        <w:pStyle w:val="ListBullet"/>
-        <w:spacing w:before="0" w:after="0" w:line="240" w:lineRule="auto"/>
-        <w:ind w:left="360" w:hanging="230"/>
-      </w:pPr>
-      <w:r>
-        <w:rPr>
-          <w:rFonts w:ascii="Calibri" w:hAnsi="Calibri"/>
-          <w:b w:val="0"/>
-          <w:i w:val="0"/>
-          <w:sz w:val="21"/>
-        </w:rPr>
-        <w:t>Performed mainframe configurations and system integration.</w:t>
-      </w:r>
-    </w:p>
-    <w:p>
-      <w:pPr>
-        <w:pStyle w:val="ListBullet"/>
-        <w:spacing w:before="0" w:after="0" w:line="240" w:lineRule="auto"/>
-        <w:ind w:left="360" w:hanging="230"/>
-      </w:pPr>
-      <w:r>
-        <w:rPr>
-          <w:rFonts w:ascii="Calibri" w:hAnsi="Calibri"/>
-          <w:b w:val="0"/>
-          <w:i w:val="0"/>
-          <w:sz w:val="21"/>
-        </w:rPr>
-        <w:t>Administered SAPS domain configurations, ensuring security and compliance.</w:t>
-      </w:r>
-    </w:p>
-    <w:p>
-      <w:pPr>
-        <w:pStyle w:val="ListBullet"/>
-        <w:spacing w:before="0" w:after="0" w:line="240" w:lineRule="auto"/>
-        <w:ind w:left="360" w:hanging="230"/>
-      </w:pPr>
-      <w:r>
-        <w:rPr>
-          <w:rFonts w:ascii="Calibri" w:hAnsi="Calibri"/>
-          <w:b w:val="0"/>
-          <w:i w:val="0"/>
-          <w:sz w:val="21"/>
-        </w:rPr>
-        <w:t>Set up email accounts and systems for users.</w:t>
-      </w:r>
-    </w:p>
-    <w:p>
-      <w:pPr>
-        <w:tabs>
-          <w:tab w:pos="10512" w:val="right"/>
-        </w:tabs>
-        <w:spacing w:before="120"/>
-      </w:pPr>
-      <w:r>
-        <w:rPr>
-          <w:rFonts w:ascii="Calibri" w:hAnsi="Calibri"/>
-          <w:b/>
-          <w:i w:val="0"/>
-          <w:sz w:val="21"/>
-        </w:rPr>
-        <w:t>Bytes Managed Solutions  |  Pretoria</w:t>
-      </w:r>
-    </w:p>
-    <w:p>
-      <w:pPr>
-        <w:tabs>
-          <w:tab w:pos="10512" w:val="right"/>
-        </w:tabs>
-        <w:spacing w:before="0"/>
-      </w:pPr>
-      <w:r>
-        <w:rPr>
-          <w:rFonts w:ascii="Calibri" w:hAnsi="Calibri"/>
-          <w:b w:val="0"/>
-          <w:i w:val="0"/>
-          <w:sz w:val="21"/>
-        </w:rPr>
-        <w:t>Senior Customer Services Representative</w:t>
-      </w:r>
-      <w:r>
-        <w:rPr>
-          <w:rFonts w:ascii="Calibri" w:hAnsi="Calibri"/>
-          <w:b w:val="0"/>
-          <w:i w:val="0"/>
-          <w:sz w:val="21"/>
-        </w:rPr>
-        <w:tab/>
-        <w:t>10/2013 – 12/2014</w:t>
-      </w:r>
-    </w:p>
-    <w:p>
-      <w:pPr>
-        <w:pStyle w:val="ListBullet"/>
-        <w:spacing w:before="0" w:after="0" w:line="240" w:lineRule="auto"/>
-        <w:ind w:left="360" w:hanging="230"/>
-      </w:pPr>
-      <w:r>
-        <w:rPr>
-          <w:rFonts w:ascii="Calibri" w:hAnsi="Calibri"/>
-          <w:b w:val="0"/>
-          <w:i w:val="0"/>
-          <w:sz w:val="21"/>
-        </w:rPr>
-        <w:t>Installed ABSA applications onto client systems.</w:t>
-      </w:r>
-    </w:p>
-    <w:p>
-      <w:pPr>
-        <w:pStyle w:val="ListBullet"/>
-        <w:spacing w:before="0" w:after="0" w:line="240" w:lineRule="auto"/>
-        <w:ind w:left="360" w:hanging="230"/>
-      </w:pPr>
-      <w:r>
-        <w:rPr>
-          <w:rFonts w:ascii="Calibri" w:hAnsi="Calibri"/>
-          <w:b w:val="0"/>
-          <w:i w:val="0"/>
-          <w:sz w:val="21"/>
-        </w:rPr>
-        <w:t>Configured and set up 3G connectivity for clients.</w:t>
-      </w:r>
-    </w:p>
-    <w:p>
-      <w:pPr>
-        <w:pStyle w:val="ListBullet"/>
-        <w:spacing w:before="0" w:after="0" w:line="240" w:lineRule="auto"/>
-        <w:ind w:left="360" w:hanging="230"/>
-      </w:pPr>
-      <w:r>
-        <w:rPr>
-          <w:rFonts w:ascii="Calibri" w:hAnsi="Calibri"/>
-          <w:b w:val="0"/>
-          <w:i w:val="0"/>
-          <w:sz w:val="21"/>
-        </w:rPr>
-        <w:t>Established VPN connections for secure remote access.</w:t>
-      </w:r>
-    </w:p>
-    <w:p>
-      <w:pPr>
-        <w:pStyle w:val="ListBullet"/>
-        <w:spacing w:before="0" w:after="0" w:line="240" w:lineRule="auto"/>
-        <w:ind w:left="360" w:hanging="230"/>
-      </w:pPr>
-      <w:r>
-        <w:rPr>
-          <w:rFonts w:ascii="Calibri" w:hAnsi="Calibri"/>
-          <w:b w:val="0"/>
-          <w:i w:val="0"/>
-          <w:sz w:val="21"/>
-        </w:rPr>
-        <w:t>Connected clients to network printers and managed print services.</w:t>
-      </w:r>
-    </w:p>
-    <w:p>
-      <w:pPr>
-        <w:pStyle w:val="ListBullet"/>
-        <w:spacing w:before="0" w:after="0" w:line="240" w:lineRule="auto"/>
-        <w:ind w:left="360" w:hanging="230"/>
-      </w:pPr>
-      <w:r>
-        <w:rPr>
-          <w:rFonts w:ascii="Calibri" w:hAnsi="Calibri"/>
-          <w:b w:val="0"/>
-          <w:i w:val="0"/>
-          <w:sz w:val="21"/>
-        </w:rPr>
-        <w:t>Set up and configured user profiles on various systems.</w:t>
-      </w:r>
-    </w:p>
-    <w:p>
-      <w:pPr>
-        <w:pStyle w:val="ListBullet"/>
-        <w:spacing w:before="0" w:after="0" w:line="240" w:lineRule="auto"/>
-        <w:ind w:left="360" w:hanging="230"/>
-      </w:pPr>
-      <w:r>
-        <w:rPr>
-          <w:rFonts w:ascii="Calibri" w:hAnsi="Calibri"/>
-          <w:b w:val="0"/>
-          <w:i w:val="0"/>
-          <w:sz w:val="21"/>
-        </w:rPr>
-        <w:t>Repaired desktop and laptop hardware components.</w:t>
-      </w:r>
-    </w:p>
-    <w:p>
-      <w:pPr>
-        <w:pStyle w:val="ListBullet"/>
-        <w:spacing w:before="0" w:after="0" w:line="240" w:lineRule="auto"/>
-        <w:ind w:left="360" w:hanging="230"/>
-      </w:pPr>
-      <w:r>
-        <w:rPr>
-          <w:rFonts w:ascii="Calibri" w:hAnsi="Calibri"/>
-          <w:b w:val="0"/>
-          <w:i w:val="0"/>
-          <w:sz w:val="21"/>
-        </w:rPr>
-        <w:t>Installed PGP encryption and other in-house developed software.</w:t>
-      </w:r>
-    </w:p>
-    <w:p>
-      <w:pPr>
-        <w:pStyle w:val="ListBullet"/>
-        <w:spacing w:before="0" w:after="0" w:line="240" w:lineRule="auto"/>
-        <w:ind w:left="360" w:hanging="230"/>
-      </w:pPr>
-      <w:r>
-        <w:rPr>
-          <w:rFonts w:ascii="Calibri" w:hAnsi="Calibri"/>
-          <w:b w:val="0"/>
-          <w:i w:val="0"/>
-          <w:sz w:val="21"/>
-        </w:rPr>
-        <w:t>Delivered in-house technical support for Barclays Bank operations.</w:t>
-      </w:r>
-    </w:p>
-    <w:p>
-      <w:pPr>
-        <w:pStyle w:val="ListBullet"/>
-        <w:spacing w:before="0" w:after="0" w:line="240" w:lineRule="auto"/>
-        <w:ind w:left="360" w:hanging="230"/>
-      </w:pPr>
-      <w:r>
-        <w:rPr>
-          <w:rFonts w:ascii="Calibri" w:hAnsi="Calibri"/>
-          <w:b w:val="0"/>
-          <w:i w:val="0"/>
-          <w:sz w:val="21"/>
-        </w:rPr>
-        <w:t>Provided Fusion support for both Barclays and Absa clients.</w:t>
-      </w:r>
-    </w:p>
-    <w:p>
-      <w:pPr>
-        <w:pStyle w:val="ListBullet"/>
-        <w:spacing w:before="0" w:after="0" w:line="240" w:lineRule="auto"/>
-        <w:ind w:left="360" w:hanging="230"/>
-      </w:pPr>
-      <w:r>
-        <w:rPr>
-          <w:rFonts w:ascii="Calibri" w:hAnsi="Calibri"/>
-          <w:b w:val="0"/>
-          <w:i w:val="0"/>
-          <w:sz w:val="21"/>
-        </w:rPr>
-        <w:t>Updated incident logs and service requests within the ServiceNow platform.</w:t>
-      </w:r>
-    </w:p>
-    <w:p>
-      <w:pPr>
-        <w:pStyle w:val="ListBullet"/>
-        <w:spacing w:before="0" w:after="0" w:line="240" w:lineRule="auto"/>
-        <w:ind w:left="360" w:hanging="230"/>
-      </w:pPr>
-      <w:r>
-        <w:rPr>
-          <w:rFonts w:ascii="Calibri" w:hAnsi="Calibri"/>
-          <w:b w:val="0"/>
-          <w:i w:val="0"/>
-          <w:sz w:val="21"/>
-        </w:rPr>
-        <w:t>Deployed applications utilising the QARS system.</w:t>
-      </w:r>
-    </w:p>
-    <w:p>
-      <w:pPr>
-        <w:tabs>
-          <w:tab w:pos="10512" w:val="right"/>
-        </w:tabs>
-        <w:spacing w:before="120"/>
-      </w:pPr>
-      <w:r>
-        <w:rPr>
-          <w:rFonts w:ascii="Calibri" w:hAnsi="Calibri"/>
-          <w:b/>
-          <w:i w:val="0"/>
-          <w:sz w:val="21"/>
-        </w:rPr>
-        <w:t>Datacentrix  |  Pretoria</w:t>
-      </w:r>
-    </w:p>
-    <w:p>
-      <w:pPr>
-        <w:tabs>
-          <w:tab w:pos="10512" w:val="right"/>
-        </w:tabs>
-        <w:spacing w:before="0"/>
-      </w:pPr>
-      <w:r>
-        <w:rPr>
-          <w:rFonts w:ascii="Calibri" w:hAnsi="Calibri"/>
-          <w:b w:val="0"/>
-          <w:i w:val="0"/>
-          <w:sz w:val="21"/>
-        </w:rPr>
-        <w:t>Field Service Specialist</w:t>
-      </w:r>
-      <w:r>
-        <w:rPr>
-          <w:rFonts w:ascii="Calibri" w:hAnsi="Calibri"/>
-          <w:b w:val="0"/>
-          <w:i w:val="0"/>
-          <w:sz w:val="21"/>
-        </w:rPr>
-        <w:tab/>
-        <w:t>06/2013 – 09/2013</w:t>
-      </w:r>
-    </w:p>
-    <w:p>
-      <w:pPr>
-        <w:pStyle w:val="ListBullet"/>
-        <w:spacing w:before="0" w:after="0" w:line="240" w:lineRule="auto"/>
-        <w:ind w:left="360" w:hanging="230"/>
-      </w:pPr>
-      <w:r>
-        <w:rPr>
-          <w:rFonts w:ascii="Calibri" w:hAnsi="Calibri"/>
-          <w:b w:val="0"/>
-          <w:i w:val="0"/>
-          <w:sz w:val="21"/>
-        </w:rPr>
-        <w:t>Provided desktop support to end-users with a focus on printer and scanner hardware.</w:t>
-      </w:r>
-    </w:p>
-    <w:p>
-      <w:pPr>
-        <w:pStyle w:val="ListBullet"/>
-        <w:spacing w:before="0" w:after="0" w:line="240" w:lineRule="auto"/>
-        <w:ind w:left="360" w:hanging="230"/>
-      </w:pPr>
-      <w:r>
-        <w:rPr>
-          <w:rFonts w:ascii="Calibri" w:hAnsi="Calibri"/>
-          <w:b w:val="0"/>
-          <w:i w:val="0"/>
-          <w:sz w:val="21"/>
-        </w:rPr>
-        <w:t>Established and managed VPN connections for remote access.</w:t>
-      </w:r>
-    </w:p>
-    <w:p>
-      <w:pPr>
-        <w:pStyle w:val="ListBullet"/>
-        <w:spacing w:before="0" w:after="0" w:line="240" w:lineRule="auto"/>
-        <w:ind w:left="360" w:hanging="230"/>
-      </w:pPr>
-      <w:r>
-        <w:rPr>
-          <w:rFonts w:ascii="Calibri" w:hAnsi="Calibri"/>
-          <w:b w:val="0"/>
-          <w:i w:val="0"/>
-          <w:sz w:val="21"/>
-        </w:rPr>
-        <w:t>Configured proxy settings for network and internet access.</w:t>
-      </w:r>
-    </w:p>
-    <w:p>
-      <w:pPr>
-        <w:pStyle w:val="ListBullet"/>
-        <w:spacing w:before="0" w:after="0" w:line="240" w:lineRule="auto"/>
-        <w:ind w:left="360" w:hanging="230"/>
-      </w:pPr>
-      <w:r>
-        <w:rPr>
-          <w:rFonts w:ascii="Calibri" w:hAnsi="Calibri"/>
-          <w:b w:val="0"/>
-          <w:i w:val="0"/>
-          <w:sz w:val="21"/>
-        </w:rPr>
-        <w:t>Set up and maintained LAN/WAN connections.</w:t>
-      </w:r>
-    </w:p>
-    <w:p>
-      <w:pPr>
-        <w:pStyle w:val="ListBullet"/>
-        <w:spacing w:before="0" w:after="0" w:line="240" w:lineRule="auto"/>
-        <w:ind w:left="360" w:hanging="230"/>
-      </w:pPr>
-      <w:r>
-        <w:rPr>
-          <w:rFonts w:ascii="Calibri" w:hAnsi="Calibri"/>
-          <w:b w:val="0"/>
-          <w:i w:val="0"/>
-          <w:sz w:val="21"/>
-        </w:rPr>
-        <w:t>Delivered remote assistance to users experiencing technical difficulties.</w:t>
-      </w:r>
-    </w:p>
-    <w:p>
-      <w:pPr>
-        <w:pStyle w:val="ListBullet"/>
-        <w:spacing w:before="0" w:after="0" w:line="240" w:lineRule="auto"/>
-        <w:ind w:left="360" w:hanging="230"/>
-      </w:pPr>
-      <w:r>
-        <w:rPr>
-          <w:rFonts w:ascii="Calibri" w:hAnsi="Calibri"/>
-          <w:b w:val="0"/>
-          <w:i w:val="0"/>
-          <w:sz w:val="21"/>
-        </w:rPr>
-        <w:t>Performed network troubleshooting to resolve connectivity issues.</w:t>
-      </w:r>
-    </w:p>
-    <w:p>
-      <w:pPr>
-        <w:tabs>
-          <w:tab w:pos="10512" w:val="right"/>
-        </w:tabs>
-        <w:spacing w:before="120"/>
-      </w:pPr>
-      <w:r>
-        <w:rPr>
-          <w:rFonts w:ascii="Calibri" w:hAnsi="Calibri"/>
-          <w:b/>
-          <w:i w:val="0"/>
-          <w:sz w:val="21"/>
-        </w:rPr>
-        <w:t>Gijima Technologies  |  Pretoria</w:t>
-      </w:r>
-    </w:p>
-    <w:p>
-      <w:pPr>
-        <w:tabs>
-          <w:tab w:pos="10512" w:val="right"/>
-        </w:tabs>
-        <w:spacing w:before="0"/>
-      </w:pPr>
-      <w:r>
-        <w:rPr>
-          <w:rFonts w:ascii="Calibri" w:hAnsi="Calibri"/>
-          <w:b w:val="0"/>
-          <w:i w:val="0"/>
-          <w:sz w:val="21"/>
-        </w:rPr>
-        <w:t>Senior Field Service Engineer</w:t>
-      </w:r>
-      <w:r>
-        <w:rPr>
-          <w:rFonts w:ascii="Calibri" w:hAnsi="Calibri"/>
-          <w:b w:val="0"/>
-          <w:i w:val="0"/>
-          <w:sz w:val="21"/>
-        </w:rPr>
-        <w:tab/>
-        <w:t>10/2008 – 03/2012</w:t>
-      </w:r>
-    </w:p>
-    <w:p>
-      <w:pPr>
-        <w:pStyle w:val="ListBullet"/>
-        <w:spacing w:before="0" w:after="0" w:line="240" w:lineRule="auto"/>
-        <w:ind w:left="360" w:hanging="230"/>
-      </w:pPr>
-      <w:r>
-        <w:rPr>
-          <w:rFonts w:ascii="Calibri" w:hAnsi="Calibri"/>
-          <w:b w:val="0"/>
-          <w:i w:val="0"/>
-          <w:sz w:val="21"/>
-        </w:rPr>
-        <w:t>Delivered comprehensive desktop support services to a diverse user base.</w:t>
-      </w:r>
-    </w:p>
-    <w:p>
-      <w:pPr>
-        <w:pStyle w:val="ListBullet"/>
-        <w:spacing w:before="0" w:after="0" w:line="240" w:lineRule="auto"/>
-        <w:ind w:left="360" w:hanging="230"/>
-      </w:pPr>
-      <w:r>
-        <w:rPr>
-          <w:rFonts w:ascii="Calibri" w:hAnsi="Calibri"/>
-          <w:b w:val="0"/>
-          <w:i w:val="0"/>
-          <w:sz w:val="21"/>
-        </w:rPr>
-        <w:t>Managed printer support and repair, minimizing downtime.</w:t>
-      </w:r>
-    </w:p>
-    <w:p>
-      <w:pPr>
-        <w:pStyle w:val="ListBullet"/>
-        <w:spacing w:before="0" w:after="0" w:line="240" w:lineRule="auto"/>
-        <w:ind w:left="360" w:hanging="230"/>
-      </w:pPr>
-      <w:r>
-        <w:rPr>
-          <w:rFonts w:ascii="Calibri" w:hAnsi="Calibri"/>
-          <w:b w:val="0"/>
-          <w:i w:val="0"/>
-          <w:sz w:val="21"/>
-        </w:rPr>
-        <w:t>Provided software support and troubleshooting for various applications.</w:t>
-      </w:r>
-    </w:p>
-    <w:p>
-      <w:pPr>
-        <w:pStyle w:val="ListBullet"/>
-        <w:spacing w:before="0" w:after="0" w:line="240" w:lineRule="auto"/>
-        <w:ind w:left="360" w:hanging="230"/>
-      </w:pPr>
-      <w:r>
-        <w:rPr>
-          <w:rFonts w:ascii="Calibri" w:hAnsi="Calibri"/>
-          <w:b w:val="0"/>
-          <w:i w:val="0"/>
-          <w:sz w:val="21"/>
-        </w:rPr>
-        <w:t>Supported the BAS application for the Office of the Premier in Limpopo.</w:t>
-      </w:r>
-    </w:p>
-    <w:p>
-      <w:pPr>
-        <w:pStyle w:val="ListBullet"/>
-        <w:spacing w:before="0" w:after="0" w:line="240" w:lineRule="auto"/>
-        <w:ind w:left="360" w:hanging="230"/>
-      </w:pPr>
-      <w:r>
-        <w:rPr>
-          <w:rFonts w:ascii="Calibri" w:hAnsi="Calibri"/>
-          <w:b w:val="0"/>
-          <w:i w:val="0"/>
-          <w:sz w:val="21"/>
-        </w:rPr>
-        <w:t>Acted as Client Account Champion, serving as the Technical Support Specialist for the Office of the Premier.</w:t>
-      </w:r>
-    </w:p>
-    <w:p>
-      <w:pPr>
-        <w:pStyle w:val="ListBullet"/>
-        <w:spacing w:before="0" w:after="0" w:line="240" w:lineRule="auto"/>
-        <w:ind w:left="360" w:hanging="230"/>
-      </w:pPr>
-      <w:r>
-        <w:rPr>
-          <w:rFonts w:ascii="Calibri" w:hAnsi="Calibri"/>
-          <w:b w:val="0"/>
-          <w:i w:val="0"/>
-          <w:sz w:val="21"/>
-        </w:rPr>
-        <w:t>Contributed to technical projects for key clients including South African Police Services, Capitec Bank, Office of the Premier (Limpopo Province), ABSA Bank, Ackermans, and Sanlam.</w:t>
-      </w:r>
-    </w:p>
-    <w:p>
-      <w:pPr>
-        <w:tabs>
-          <w:tab w:pos="10512" w:val="right"/>
-        </w:tabs>
-        <w:spacing w:before="120"/>
-      </w:pPr>
-      <w:r>
-        <w:rPr>
-          <w:rFonts w:ascii="Calibri" w:hAnsi="Calibri"/>
-          <w:b/>
-          <w:i w:val="0"/>
-          <w:sz w:val="21"/>
-        </w:rPr>
-        <w:t>Sizwe IT Group  |  Pretoria</w:t>
-      </w:r>
-    </w:p>
-    <w:p>
-      <w:pPr>
-        <w:tabs>
-          <w:tab w:pos="10512" w:val="right"/>
-        </w:tabs>
-        <w:spacing w:before="0"/>
-      </w:pPr>
-      <w:r>
-        <w:rPr>
-          <w:rFonts w:ascii="Calibri" w:hAnsi="Calibri"/>
-          <w:b w:val="0"/>
-          <w:i w:val="0"/>
-          <w:sz w:val="21"/>
-        </w:rPr>
-        <w:t>Senior Field Service Engineer</w:t>
-      </w:r>
-      <w:r>
-        <w:rPr>
-          <w:rFonts w:ascii="Calibri" w:hAnsi="Calibri"/>
-          <w:b w:val="0"/>
-          <w:i w:val="0"/>
-          <w:sz w:val="21"/>
-        </w:rPr>
-        <w:tab/>
-        <w:t>10/2007 – 10/2008</w:t>
-      </w:r>
-    </w:p>
-    <w:p>
-      <w:pPr>
-        <w:pStyle w:val="ListBullet"/>
-        <w:spacing w:before="0" w:after="0" w:line="240" w:lineRule="auto"/>
-        <w:ind w:left="360" w:hanging="230"/>
-      </w:pPr>
-      <w:r>
-        <w:rPr>
-          <w:rFonts w:ascii="Calibri" w:hAnsi="Calibri"/>
-          <w:b w:val="0"/>
-          <w:i w:val="0"/>
-          <w:sz w:val="21"/>
-        </w:rPr>
-        <w:t>Rendered desktop support services, addressing hardware and software issues.</w:t>
-      </w:r>
-    </w:p>
-    <w:p>
-      <w:pPr>
-        <w:pStyle w:val="ListBullet"/>
-        <w:spacing w:before="0" w:after="0" w:line="240" w:lineRule="auto"/>
-        <w:ind w:left="360" w:hanging="230"/>
-      </w:pPr>
-      <w:r>
-        <w:rPr>
-          <w:rFonts w:ascii="Calibri" w:hAnsi="Calibri"/>
-          <w:b w:val="0"/>
-          <w:i w:val="0"/>
-          <w:sz w:val="21"/>
-        </w:rPr>
-        <w:t>Handled printer support and repairs, ensuring operational efficiency.</w:t>
-      </w:r>
-    </w:p>
-    <w:p>
-      <w:pPr>
-        <w:pStyle w:val="ListBullet"/>
-        <w:spacing w:before="0" w:after="0" w:line="240" w:lineRule="auto"/>
-        <w:ind w:left="360" w:hanging="230"/>
-      </w:pPr>
-      <w:r>
-        <w:rPr>
-          <w:rFonts w:ascii="Calibri" w:hAnsi="Calibri"/>
-          <w:b w:val="0"/>
-          <w:i w:val="0"/>
-          <w:sz w:val="21"/>
-        </w:rPr>
-        <w:t>Provided software support and troubleshooting across multiple platforms.</w:t>
-      </w:r>
-    </w:p>
-    <w:p>
-      <w:pPr>
-        <w:pStyle w:val="ListBullet"/>
-        <w:spacing w:before="0" w:after="0" w:line="240" w:lineRule="auto"/>
-        <w:ind w:left="360" w:hanging="230"/>
-      </w:pPr>
-      <w:r>
-        <w:rPr>
-          <w:rFonts w:ascii="Calibri" w:hAnsi="Calibri"/>
-          <w:b w:val="0"/>
-          <w:i w:val="0"/>
-          <w:sz w:val="21"/>
-        </w:rPr>
-        <w:t>Supported the BAS application for the Office of the Premier in Limpopo.</w:t>
-      </w:r>
-    </w:p>
-    <w:p>
-      <w:pPr>
-        <w:pStyle w:val="ListBullet"/>
-        <w:spacing w:before="0" w:after="0" w:line="240" w:lineRule="auto"/>
-        <w:ind w:left="360" w:hanging="230"/>
-      </w:pPr>
-      <w:r>
-        <w:rPr>
-          <w:rFonts w:ascii="Calibri" w:hAnsi="Calibri"/>
-          <w:b w:val="0"/>
-          <w:i w:val="0"/>
-          <w:sz w:val="21"/>
-        </w:rPr>
-        <w:t>Served as Client Account Champion and Technical Support Specialist for the Office of the Premier.</w:t>
-      </w:r>
-    </w:p>
-    <w:p>
-      <w:pPr>
-        <w:pStyle w:val="ListBullet"/>
-        <w:spacing w:before="0" w:after="0" w:line="240" w:lineRule="auto"/>
-        <w:ind w:left="360" w:hanging="230"/>
-      </w:pPr>
-      <w:r>
-        <w:rPr>
-          <w:rFonts w:ascii="Calibri" w:hAnsi="Calibri"/>
-          <w:b w:val="0"/>
-          <w:i w:val="0"/>
-          <w:sz w:val="21"/>
-        </w:rPr>
-        <w:t>Participated in technical projects for notable clients: South African Police Services, Capitec Bank, Office of the Premier (Limpopo Province), ABSA Bank, Ackermans, and Sanlam.</w:t>
-      </w:r>
-    </w:p>
-    <w:p>
-      <w:pPr>
-        <w:tabs>
-          <w:tab w:pos="10512" w:val="right"/>
-        </w:tabs>
-        <w:spacing w:before="120"/>
-      </w:pPr>
-      <w:r>
-        <w:rPr>
-          <w:rFonts w:ascii="Calibri" w:hAnsi="Calibri"/>
-          <w:b/>
-          <w:i w:val="0"/>
-          <w:sz w:val="21"/>
-        </w:rPr>
-        <w:t>Tasima  |  Pretoria</w:t>
-      </w:r>
-    </w:p>
-    <w:p>
-      <w:pPr>
-        <w:tabs>
-          <w:tab w:pos="10512" w:val="right"/>
-        </w:tabs>
-        <w:spacing w:before="0"/>
-      </w:pPr>
-      <w:r>
-        <w:rPr>
-          <w:rFonts w:ascii="Calibri" w:hAnsi="Calibri"/>
-          <w:b w:val="0"/>
-          <w:i w:val="0"/>
-          <w:sz w:val="21"/>
-        </w:rPr>
-        <w:t>Desktop Support</w:t>
-      </w:r>
-      <w:r>
-        <w:rPr>
-          <w:rFonts w:ascii="Calibri" w:hAnsi="Calibri"/>
-          <w:b w:val="0"/>
-          <w:i w:val="0"/>
-          <w:sz w:val="21"/>
-        </w:rPr>
-        <w:tab/>
-        <w:t>10/2003 – 09/2007</w:t>
-      </w:r>
-    </w:p>
-    <w:p>
-      <w:pPr>
-        <w:pStyle w:val="ListBullet"/>
-        <w:spacing w:before="0" w:after="0" w:line="240" w:lineRule="auto"/>
-        <w:ind w:left="360" w:hanging="230"/>
-      </w:pPr>
-      <w:r>
-        <w:rPr>
-          <w:rFonts w:ascii="Calibri" w:hAnsi="Calibri"/>
-          <w:b w:val="0"/>
-          <w:i w:val="0"/>
-          <w:sz w:val="21"/>
-        </w:rPr>
-        <w:t>Provided eNaTIS software and hardware support, ensuring system functionality.</w:t>
-      </w:r>
-    </w:p>
-    <w:p>
-      <w:pPr>
-        <w:pStyle w:val="ListBullet"/>
-        <w:spacing w:before="0" w:after="0" w:line="240" w:lineRule="auto"/>
-        <w:ind w:left="360" w:hanging="230"/>
-      </w:pPr>
-      <w:r>
-        <w:rPr>
-          <w:rFonts w:ascii="Calibri" w:hAnsi="Calibri"/>
-          <w:b w:val="0"/>
-          <w:i w:val="0"/>
-          <w:sz w:val="21"/>
-        </w:rPr>
-        <w:t>Conducted site audits to assess and document IT infrastructure.</w:t>
-      </w:r>
-    </w:p>
-    <w:p>
-      <w:pPr>
-        <w:pStyle w:val="ListBullet"/>
-        <w:spacing w:before="0" w:after="0" w:line="240" w:lineRule="auto"/>
-        <w:ind w:left="360" w:hanging="230"/>
-      </w:pPr>
-      <w:r>
-        <w:rPr>
-          <w:rFonts w:ascii="Calibri" w:hAnsi="Calibri"/>
-          <w:b w:val="0"/>
-          <w:i w:val="0"/>
-          <w:sz w:val="21"/>
-        </w:rPr>
-        <w:t>Delivered technical support for the eNaTIS system, resolving user issues.</w:t>
-      </w:r>
-    </w:p>
-    <w:p>
-      <w:pPr>
-        <w:pStyle w:val="ListBullet"/>
-        <w:spacing w:before="0" w:after="0" w:line="240" w:lineRule="auto"/>
-        <w:ind w:left="360" w:hanging="230"/>
-      </w:pPr>
-      <w:r>
-        <w:rPr>
-          <w:rFonts w:ascii="Calibri" w:hAnsi="Calibri"/>
-          <w:b w:val="0"/>
-          <w:i w:val="0"/>
-          <w:sz w:val="21"/>
-        </w:rPr>
-        <w:t>Performed job quality checks post-deployment to verify successful installations.</w:t>
-      </w:r>
-    </w:p>
-    <w:p>
-      <w:pPr>
-        <w:pStyle w:val="ListBullet"/>
-        <w:spacing w:before="0" w:after="0" w:line="240" w:lineRule="auto"/>
-        <w:ind w:left="360" w:hanging="230"/>
-      </w:pPr>
-      <w:r>
-        <w:rPr>
-          <w:rFonts w:ascii="Calibri" w:hAnsi="Calibri"/>
-          <w:b w:val="0"/>
-          <w:i w:val="0"/>
-          <w:sz w:val="21"/>
-        </w:rPr>
-        <w:t>Managed technical teams, overseeing daily operations and task allocation.</w:t>
-      </w:r>
-    </w:p>
-    <w:p>
-      <w:pPr>
-        <w:pStyle w:val="ListBullet"/>
-        <w:spacing w:before="0" w:after="0" w:line="240" w:lineRule="auto"/>
-        <w:ind w:left="360" w:hanging="230"/>
-      </w:pPr>
-      <w:r>
-        <w:rPr>
-          <w:rFonts w:ascii="Calibri" w:hAnsi="Calibri"/>
-          <w:b w:val="0"/>
-          <w:i w:val="0"/>
-          <w:sz w:val="21"/>
-        </w:rPr>
-        <w:t>Undertook extensive fieldwork to support clients across various locations.</w:t>
-      </w:r>
-    </w:p>
-    <w:p>
-      <w:pPr>
-        <w:pStyle w:val="ListBullet"/>
-        <w:spacing w:before="0" w:after="0" w:line="240" w:lineRule="auto"/>
-        <w:ind w:left="360" w:hanging="230"/>
-      </w:pPr>
-      <w:r>
-        <w:rPr>
-          <w:rFonts w:ascii="Calibri" w:hAnsi="Calibri"/>
-          <w:b w:val="0"/>
-          <w:i w:val="0"/>
-          <w:sz w:val="21"/>
-        </w:rPr>
-        <w:t>Directed software deployment projects on a national scale.</w:t>
-      </w:r>
-    </w:p>
-    <w:p>
-      <w:pPr>
-        <w:pStyle w:val="ListBullet"/>
-        <w:spacing w:before="0" w:after="0" w:line="240" w:lineRule="auto"/>
-        <w:ind w:left="360" w:hanging="230"/>
-      </w:pPr>
-      <w:r>
-        <w:rPr>
-          <w:rFonts w:ascii="Calibri" w:hAnsi="Calibri"/>
-          <w:b w:val="0"/>
-          <w:i w:val="0"/>
-          <w:sz w:val="21"/>
-        </w:rPr>
-        <w:t>Offered desktop support, troubleshooting user hardware and software problems.</w:t>
-      </w:r>
-    </w:p>
-    <w:p>
-      <w:pPr>
-        <w:pStyle w:val="ListBullet"/>
-        <w:spacing w:before="0" w:after="0" w:line="240" w:lineRule="auto"/>
-        <w:ind w:left="360" w:hanging="230"/>
-      </w:pPr>
-      <w:r>
-        <w:rPr>
-          <w:rFonts w:ascii="Calibri" w:hAnsi="Calibri"/>
-          <w:b w:val="0"/>
-          <w:i w:val="0"/>
-          <w:sz w:val="21"/>
-        </w:rPr>
-        <w:t>Provided in-house application support for Barclays Bank systems.</w:t>
-      </w:r>
-    </w:p>
-    <w:p>
-      <w:pPr>
-        <w:pStyle w:val="ListBullet"/>
-        <w:spacing w:before="0" w:after="0" w:line="240" w:lineRule="auto"/>
-        <w:ind w:left="360" w:hanging="230"/>
-      </w:pPr>
-      <w:r>
-        <w:rPr>
-          <w:rFonts w:ascii="Calibri" w:hAnsi="Calibri"/>
-          <w:b w:val="0"/>
-          <w:i w:val="0"/>
-          <w:sz w:val="21"/>
-        </w:rPr>
-        <w:t>Configured 3G modems for mobile connectivity.</w:t>
-      </w:r>
-    </w:p>
-    <w:p>
-      <w:pPr>
-        <w:pStyle w:val="ListBullet"/>
-        <w:spacing w:before="0" w:after="0" w:line="240" w:lineRule="auto"/>
-        <w:ind w:left="360" w:hanging="230"/>
-      </w:pPr>
-      <w:r>
-        <w:rPr>
-          <w:rFonts w:ascii="Calibri" w:hAnsi="Calibri"/>
-          <w:b w:val="0"/>
-          <w:i w:val="0"/>
-          <w:sz w:val="21"/>
-        </w:rPr>
-        <w:t>Administered and supported Citrix environments.</w:t>
-      </w:r>
-    </w:p>
-    <w:p>
-      <w:pPr>
-        <w:pStyle w:val="ListBullet"/>
-        <w:spacing w:before="0" w:after="0" w:line="240" w:lineRule="auto"/>
-        <w:ind w:left="360" w:hanging="230"/>
-      </w:pPr>
-      <w:r>
-        <w:rPr>
-          <w:rFonts w:ascii="Calibri" w:hAnsi="Calibri"/>
-          <w:b w:val="0"/>
-          <w:i w:val="0"/>
-          <w:sz w:val="21"/>
-        </w:rPr>
-        <w:t>Repaired HP and Lenovo laptops, restoring functionality.</w:t>
-      </w:r>
-    </w:p>
-    <w:p>
-      <w:pPr>
-        <w:pStyle w:val="ListBullet"/>
-        <w:spacing w:before="0" w:after="0" w:line="240" w:lineRule="auto"/>
-        <w:ind w:left="360" w:hanging="230"/>
-      </w:pPr>
-      <w:r>
-        <w:rPr>
-          <w:rFonts w:ascii="Calibri" w:hAnsi="Calibri"/>
-          <w:b w:val="0"/>
-          <w:i w:val="0"/>
-          <w:sz w:val="21"/>
-        </w:rPr>
-        <w:t>Set up Cisco IP phones for new client installations.</w:t>
-      </w:r>
-    </w:p>
-    <w:p>
-      <w:pPr>
-        <w:pStyle w:val="ListBullet"/>
-        <w:spacing w:before="0" w:after="0" w:line="240" w:lineRule="auto"/>
-        <w:ind w:left="360" w:hanging="230"/>
-      </w:pPr>
-      <w:r>
-        <w:rPr>
-          <w:rFonts w:ascii="Calibri" w:hAnsi="Calibri"/>
-          <w:b w:val="0"/>
-          <w:i w:val="0"/>
-          <w:sz w:val="21"/>
-        </w:rPr>
-        <w:t>Configured Microsoft Outlook for new users, facilitating email access.</w:t>
-      </w:r>
-    </w:p>
-    <w:p>
-      <w:pPr>
-        <w:spacing w:before="160" w:after="40"/>
         <w:pBdr>
           <w:bottom w:val="single" w:sz="6" w:space="1" w:color="000000"/>
         </w:pBdr>
+        <w:spacing w:before="240" w:after="60"/>
       </w:pPr>
       <w:r>
         <w:rPr>
@@ -1712,133 +2321,292 @@
     </w:p>
     <w:p>
       <w:pPr>
-        <w:tabs>
-          <w:tab w:pos="10512" w:val="right"/>
-        </w:tabs>
-        <w:spacing w:before="80"/>
+        <w:spacing w:after="0" w:before="0" w:line="100" w:lineRule="exact"/>
       </w:pPr>
-      <w:r>
-        <w:rPr>
-          <w:rFonts w:ascii="Calibri" w:hAnsi="Calibri"/>
-          <w:b/>
-          <w:i w:val="0"/>
-          <w:sz w:val="21"/>
-        </w:rPr>
-        <w:t>System Administrator (MS SQL DB) with SAP NetWeaver 7.0</w:t>
-      </w:r>
-      <w:r>
-        <w:rPr>
-          <w:rFonts w:ascii="Calibri" w:hAnsi="Calibri"/>
-          <w:b w:val="0"/>
-          <w:i w:val="0"/>
-          <w:sz w:val="21"/>
-        </w:rPr>
-        <w:tab/>
-        <w:t>2012</w:t>
-      </w:r>
     </w:p>
+    <w:tbl>
+      <w:tblPr>
+        <w:tblW w:type="auto" w:w="0"/>
+        <w:jc w:val="left"/>
+        <w:tblLook w:firstColumn="1" w:firstRow="1" w:lastColumn="0" w:lastRow="0" w:noHBand="0" w:noVBand="1" w:val="04A0"/>
+        <w:tblBorders>
+          <w:top w:val="none" w:sz="0" w:space="0"/>
+          <w:left w:val="none" w:sz="0" w:space="0"/>
+          <w:bottom w:val="none" w:sz="0" w:space="0"/>
+          <w:right w:val="none" w:sz="0" w:space="0"/>
+          <w:insideH w:val="none" w:sz="0" w:space="0"/>
+          <w:insideV w:val="none" w:sz="0" w:space="0"/>
+        </w:tblBorders>
+        <w:tblLayout w:type="fixed"/>
+      </w:tblPr>
+      <w:tblGrid>
+        <w:gridCol w:w="5256"/>
+        <w:gridCol w:w="5256"/>
+      </w:tblGrid>
+      <w:tr>
+        <w:tc>
+          <w:tcPr>
+            <w:tcW w:type="dxa" w:w="1800"/>
+            <w:tcMar>
+              <w:top w:w="0" w:type="dxa"/>
+              <w:left w:w="0" w:type="dxa"/>
+              <w:bottom w:w="0" w:type="dxa"/>
+              <w:right w:w="120" w:type="dxa"/>
+            </w:tcMar>
+            <w:vAlign w:val="top"/>
+          </w:tcPr>
+          <w:p>
+            <w:pPr>
+              <w:spacing w:before="20"/>
+            </w:pPr>
+            <w:r>
+              <w:rPr>
+                <w:rFonts w:ascii="Calibri" w:hAnsi="Calibri"/>
+                <w:b w:val="0"/>
+                <w:i w:val="0"/>
+                <w:color w:val="555555"/>
+                <w:sz w:val="19"/>
+              </w:rPr>
+              <w:t>2012</w:t>
+            </w:r>
+          </w:p>
+        </w:tc>
+        <w:tc>
+          <w:tcPr>
+            <w:tcW w:type="dxa" w:w="8712"/>
+            <w:tcMar>
+              <w:top w:w="0" w:type="dxa"/>
+              <w:left w:w="0" w:type="dxa"/>
+              <w:bottom w:w="0" w:type="dxa"/>
+              <w:right w:w="0" w:type="dxa"/>
+            </w:tcMar>
+            <w:vAlign w:val="top"/>
+          </w:tcPr>
+          <w:p>
+            <w:pPr>
+              <w:spacing w:after="0"/>
+            </w:pPr>
+            <w:r>
+              <w:rPr>
+                <w:rFonts w:ascii="Calibri" w:hAnsi="Calibri"/>
+                <w:b/>
+                <w:i w:val="0"/>
+                <w:sz w:val="21"/>
+              </w:rPr>
+              <w:t>System Administrator (MS SQL DB) with SAP NetWeaver 7.0</w:t>
+            </w:r>
+          </w:p>
+          <w:p>
+            <w:pPr>
+              <w:spacing w:after="0"/>
+            </w:pPr>
+            <w:r>
+              <w:rPr>
+                <w:rFonts w:ascii="Calibri" w:hAnsi="Calibri"/>
+                <w:b w:val="0"/>
+                <w:i/>
+                <w:sz w:val="21"/>
+              </w:rPr>
+              <w:t>SAP Academy Johannesburg</w:t>
+            </w:r>
+          </w:p>
+        </w:tc>
+      </w:tr>
+    </w:tbl>
     <w:p>
       <w:pPr>
-        <w:spacing w:before="0"/>
+        <w:spacing w:after="0" w:before="0" w:line="160" w:lineRule="exact"/>
       </w:pPr>
-      <w:r>
-        <w:rPr>
-          <w:rFonts w:ascii="Calibri" w:hAnsi="Calibri"/>
-          <w:b w:val="0"/>
-          <w:i/>
-          <w:sz w:val="21"/>
-        </w:rPr>
-        <w:t>SAP Academy Johannesburg</w:t>
-      </w:r>
     </w:p>
+    <w:tbl>
+      <w:tblPr>
+        <w:tblW w:type="auto" w:w="0"/>
+        <w:jc w:val="left"/>
+        <w:tblLook w:firstColumn="1" w:firstRow="1" w:lastColumn="0" w:lastRow="0" w:noHBand="0" w:noVBand="1" w:val="04A0"/>
+        <w:tblBorders>
+          <w:top w:val="none" w:sz="0" w:space="0"/>
+          <w:left w:val="none" w:sz="0" w:space="0"/>
+          <w:bottom w:val="none" w:sz="0" w:space="0"/>
+          <w:right w:val="none" w:sz="0" w:space="0"/>
+          <w:insideH w:val="none" w:sz="0" w:space="0"/>
+          <w:insideV w:val="none" w:sz="0" w:space="0"/>
+        </w:tblBorders>
+        <w:tblLayout w:type="fixed"/>
+      </w:tblPr>
+      <w:tblGrid>
+        <w:gridCol w:w="5256"/>
+        <w:gridCol w:w="5256"/>
+      </w:tblGrid>
+      <w:tr>
+        <w:tc>
+          <w:tcPr>
+            <w:tcW w:type="dxa" w:w="1800"/>
+            <w:tcMar>
+              <w:top w:w="0" w:type="dxa"/>
+              <w:left w:w="0" w:type="dxa"/>
+              <w:bottom w:w="0" w:type="dxa"/>
+              <w:right w:w="120" w:type="dxa"/>
+            </w:tcMar>
+            <w:vAlign w:val="top"/>
+          </w:tcPr>
+          <w:p>
+            <w:pPr>
+              <w:spacing w:before="20"/>
+            </w:pPr>
+            <w:r>
+              <w:rPr>
+                <w:rFonts w:ascii="Calibri" w:hAnsi="Calibri"/>
+                <w:b w:val="0"/>
+                <w:i w:val="0"/>
+                <w:color w:val="555555"/>
+                <w:sz w:val="19"/>
+              </w:rPr>
+              <w:t>2019</w:t>
+            </w:r>
+          </w:p>
+        </w:tc>
+        <w:tc>
+          <w:tcPr>
+            <w:tcW w:type="dxa" w:w="8712"/>
+            <w:tcMar>
+              <w:top w:w="0" w:type="dxa"/>
+              <w:left w:w="0" w:type="dxa"/>
+              <w:bottom w:w="0" w:type="dxa"/>
+              <w:right w:w="0" w:type="dxa"/>
+            </w:tcMar>
+            <w:vAlign w:val="top"/>
+          </w:tcPr>
+          <w:p>
+            <w:pPr>
+              <w:spacing w:after="0"/>
+            </w:pPr>
+            <w:r>
+              <w:rPr>
+                <w:rFonts w:ascii="Calibri" w:hAnsi="Calibri"/>
+                <w:b/>
+                <w:i w:val="0"/>
+                <w:sz w:val="21"/>
+              </w:rPr>
+              <w:t>Administering Microsoft System Center Configuration Manager and Cloud Services Integration</w:t>
+            </w:r>
+          </w:p>
+          <w:p>
+            <w:pPr>
+              <w:spacing w:after="0"/>
+            </w:pPr>
+            <w:r>
+              <w:rPr>
+                <w:rFonts w:ascii="Calibri" w:hAnsi="Calibri"/>
+                <w:b w:val="0"/>
+                <w:i/>
+                <w:sz w:val="21"/>
+              </w:rPr>
+              <w:t>Microsoft</w:t>
+            </w:r>
+          </w:p>
+        </w:tc>
+      </w:tr>
+    </w:tbl>
     <w:p>
       <w:pPr>
-        <w:tabs>
-          <w:tab w:pos="10512" w:val="right"/>
-        </w:tabs>
-        <w:spacing w:before="80"/>
+        <w:spacing w:after="0" w:before="0" w:line="160" w:lineRule="exact"/>
       </w:pPr>
-      <w:r>
-        <w:rPr>
-          <w:rFonts w:ascii="Calibri" w:hAnsi="Calibri"/>
-          <w:b/>
-          <w:i w:val="0"/>
-          <w:sz w:val="21"/>
-        </w:rPr>
-        <w:t>Administering Microsoft System Center Configuration Manager and Cloud Services Integration</w:t>
-      </w:r>
-      <w:r>
-        <w:rPr>
-          <w:rFonts w:ascii="Calibri" w:hAnsi="Calibri"/>
-          <w:b w:val="0"/>
-          <w:i w:val="0"/>
-          <w:sz w:val="21"/>
-        </w:rPr>
-        <w:tab/>
-        <w:t>2019</w:t>
-      </w:r>
     </w:p>
+    <w:tbl>
+      <w:tblPr>
+        <w:tblW w:type="auto" w:w="0"/>
+        <w:jc w:val="left"/>
+        <w:tblLook w:firstColumn="1" w:firstRow="1" w:lastColumn="0" w:lastRow="0" w:noHBand="0" w:noVBand="1" w:val="04A0"/>
+        <w:tblBorders>
+          <w:top w:val="none" w:sz="0" w:space="0"/>
+          <w:left w:val="none" w:sz="0" w:space="0"/>
+          <w:bottom w:val="none" w:sz="0" w:space="0"/>
+          <w:right w:val="none" w:sz="0" w:space="0"/>
+          <w:insideH w:val="none" w:sz="0" w:space="0"/>
+          <w:insideV w:val="none" w:sz="0" w:space="0"/>
+        </w:tblBorders>
+        <w:tblLayout w:type="fixed"/>
+      </w:tblPr>
+      <w:tblGrid>
+        <w:gridCol w:w="5256"/>
+        <w:gridCol w:w="5256"/>
+      </w:tblGrid>
+      <w:tr>
+        <w:tc>
+          <w:tcPr>
+            <w:tcW w:type="dxa" w:w="1800"/>
+            <w:tcMar>
+              <w:top w:w="0" w:type="dxa"/>
+              <w:left w:w="0" w:type="dxa"/>
+              <w:bottom w:w="0" w:type="dxa"/>
+              <w:right w:w="120" w:type="dxa"/>
+            </w:tcMar>
+            <w:vAlign w:val="top"/>
+          </w:tcPr>
+          <w:p>
+            <w:pPr>
+              <w:spacing w:before="20"/>
+            </w:pPr>
+            <w:r>
+              <w:rPr>
+                <w:rFonts w:ascii="Calibri" w:hAnsi="Calibri"/>
+                <w:b w:val="0"/>
+                <w:i w:val="0"/>
+                <w:color w:val="555555"/>
+                <w:sz w:val="19"/>
+              </w:rPr>
+              <w:t>2022</w:t>
+            </w:r>
+          </w:p>
+        </w:tc>
+        <w:tc>
+          <w:tcPr>
+            <w:tcW w:type="dxa" w:w="8712"/>
+            <w:tcMar>
+              <w:top w:w="0" w:type="dxa"/>
+              <w:left w:w="0" w:type="dxa"/>
+              <w:bottom w:w="0" w:type="dxa"/>
+              <w:right w:w="0" w:type="dxa"/>
+            </w:tcMar>
+            <w:vAlign w:val="top"/>
+          </w:tcPr>
+          <w:p>
+            <w:pPr>
+              <w:spacing w:after="0"/>
+            </w:pPr>
+            <w:r>
+              <w:rPr>
+                <w:rFonts w:ascii="Calibri" w:hAnsi="Calibri"/>
+                <w:b/>
+                <w:i w:val="0"/>
+                <w:sz w:val="21"/>
+              </w:rPr>
+              <w:t>ITIL 4 Foundation</w:t>
+            </w:r>
+          </w:p>
+          <w:p>
+            <w:pPr>
+              <w:spacing w:after="0"/>
+            </w:pPr>
+            <w:r>
+              <w:rPr>
+                <w:rFonts w:ascii="Calibri" w:hAnsi="Calibri"/>
+                <w:b w:val="0"/>
+                <w:i/>
+                <w:sz w:val="21"/>
+              </w:rPr>
+              <w:t>PeopleCert</w:t>
+            </w:r>
+          </w:p>
+        </w:tc>
+      </w:tr>
+    </w:tbl>
     <w:p>
       <w:pPr>
-        <w:spacing w:before="0"/>
-      </w:pPr>
-      <w:r>
-        <w:rPr>
-          <w:rFonts w:ascii="Calibri" w:hAnsi="Calibri"/>
-          <w:b w:val="0"/>
-          <w:i/>
-          <w:sz w:val="21"/>
-        </w:rPr>
-        <w:t>Microsoft</w:t>
-      </w:r>
-    </w:p>
-    <w:p>
-      <w:pPr>
-        <w:tabs>
-          <w:tab w:pos="10512" w:val="right"/>
-        </w:tabs>
-        <w:spacing w:before="80"/>
-      </w:pPr>
-      <w:r>
-        <w:rPr>
-          <w:rFonts w:ascii="Calibri" w:hAnsi="Calibri"/>
-          <w:b/>
-          <w:i w:val="0"/>
-          <w:sz w:val="21"/>
-        </w:rPr>
-        <w:t>ITIL 4 Foundation</w:t>
-      </w:r>
-      <w:r>
-        <w:rPr>
-          <w:rFonts w:ascii="Calibri" w:hAnsi="Calibri"/>
-          <w:b w:val="0"/>
-          <w:i w:val="0"/>
-          <w:sz w:val="21"/>
-        </w:rPr>
-        <w:tab/>
-        <w:t>2022</w:t>
-      </w:r>
-    </w:p>
-    <w:p>
-      <w:pPr>
-        <w:spacing w:before="0"/>
-      </w:pPr>
-      <w:r>
-        <w:rPr>
-          <w:rFonts w:ascii="Calibri" w:hAnsi="Calibri"/>
-          <w:b w:val="0"/>
-          <w:i/>
-          <w:sz w:val="21"/>
-        </w:rPr>
-        <w:t>PeopleCert</w:t>
-      </w:r>
-    </w:p>
-    <w:p>
-      <w:pPr>
-        <w:spacing w:before="160" w:after="40"/>
         <w:pBdr>
           <w:bottom w:val="single" w:sz="6" w:space="1" w:color="000000"/>
         </w:pBdr>
+        <w:spacing w:before="240" w:after="60"/>
       </w:pPr>
       <w:r>
         <w:rPr>
@@ -1852,148 +2620,360 @@
     </w:p>
     <w:p>
       <w:pPr>
-        <w:tabs>
-          <w:tab w:pos="10512" w:val="right"/>
-        </w:tabs>
-        <w:spacing w:before="80"/>
+        <w:spacing w:after="0" w:before="0" w:line="100" w:lineRule="exact"/>
       </w:pPr>
-      <w:r>
-        <w:rPr>
-          <w:rFonts w:ascii="Calibri" w:hAnsi="Calibri"/>
-          <w:b/>
-          <w:i w:val="0"/>
-          <w:sz w:val="21"/>
-        </w:rPr>
-        <w:t xml:space="preserve">Mafiliki Magakwe  —  </w:t>
-      </w:r>
-      <w:r>
-        <w:rPr>
-          <w:rFonts w:ascii="Calibri" w:hAnsi="Calibri"/>
-          <w:b w:val="0"/>
-          <w:i/>
-          <w:sz w:val="21"/>
-        </w:rPr>
-        <w:t>Team Leader, ABSA Africa Messaging</w:t>
-      </w:r>
-      <w:r>
-        <w:rPr>
-          <w:rFonts w:ascii="Calibri" w:hAnsi="Calibri"/>
-          <w:b w:val="0"/>
-          <w:i w:val="0"/>
-          <w:sz w:val="21"/>
-        </w:rPr>
-        <w:tab/>
-        <w:t>011 350 4031</w:t>
-      </w:r>
     </w:p>
+    <w:tbl>
+      <w:tblPr>
+        <w:tblW w:type="auto" w:w="0"/>
+        <w:jc w:val="left"/>
+        <w:tblLook w:firstColumn="1" w:firstRow="1" w:lastColumn="0" w:lastRow="0" w:noHBand="0" w:noVBand="1" w:val="04A0"/>
+        <w:tblBorders>
+          <w:top w:val="none" w:sz="0" w:space="0"/>
+          <w:left w:val="none" w:sz="0" w:space="0"/>
+          <w:bottom w:val="none" w:sz="0" w:space="0"/>
+          <w:right w:val="none" w:sz="0" w:space="0"/>
+          <w:insideH w:val="none" w:sz="0" w:space="0"/>
+          <w:insideV w:val="none" w:sz="0" w:space="0"/>
+        </w:tblBorders>
+        <w:tblLayout w:type="fixed"/>
+      </w:tblPr>
+      <w:tblGrid>
+        <w:gridCol w:w="5256"/>
+        <w:gridCol w:w="5256"/>
+      </w:tblGrid>
+      <w:tr>
+        <w:tc>
+          <w:tcPr>
+            <w:tcW w:type="dxa" w:w="1800"/>
+            <w:tcMar>
+              <w:top w:w="0" w:type="dxa"/>
+              <w:left w:w="0" w:type="dxa"/>
+              <w:bottom w:w="0" w:type="dxa"/>
+              <w:right w:w="120" w:type="dxa"/>
+            </w:tcMar>
+            <w:vAlign w:val="top"/>
+          </w:tcPr>
+          <w:p>
+            <w:pPr>
+              <w:spacing w:before="20"/>
+            </w:pPr>
+            <w:r>
+              <w:rPr>
+                <w:rFonts w:ascii="Calibri" w:hAnsi="Calibri"/>
+                <w:b w:val="0"/>
+                <w:i w:val="0"/>
+                <w:color w:val="555555"/>
+                <w:sz w:val="19"/>
+              </w:rPr>
+              <w:t>011 350 4031</w:t>
+            </w:r>
+          </w:p>
+        </w:tc>
+        <w:tc>
+          <w:tcPr>
+            <w:tcW w:type="dxa" w:w="8712"/>
+            <w:tcMar>
+              <w:top w:w="0" w:type="dxa"/>
+              <w:left w:w="0" w:type="dxa"/>
+              <w:bottom w:w="0" w:type="dxa"/>
+              <w:right w:w="0" w:type="dxa"/>
+            </w:tcMar>
+            <w:vAlign w:val="top"/>
+          </w:tcPr>
+          <w:p>
+            <w:pPr>
+              <w:spacing w:after="0"/>
+            </w:pPr>
+            <w:r>
+              <w:rPr>
+                <w:rFonts w:ascii="Calibri" w:hAnsi="Calibri"/>
+                <w:b/>
+                <w:i w:val="0"/>
+                <w:sz w:val="21"/>
+              </w:rPr>
+              <w:t xml:space="preserve">Mafiliki Magakwe  —  </w:t>
+            </w:r>
+            <w:r>
+              <w:rPr>
+                <w:rFonts w:ascii="Calibri" w:hAnsi="Calibri"/>
+                <w:b w:val="0"/>
+                <w:i/>
+                <w:sz w:val="21"/>
+              </w:rPr>
+              <w:t>Team Leader, ABSA Africa Messaging</w:t>
+            </w:r>
+          </w:p>
+        </w:tc>
+      </w:tr>
+    </w:tbl>
     <w:p>
       <w:pPr>
-        <w:tabs>
-          <w:tab w:pos="10512" w:val="right"/>
-        </w:tabs>
-        <w:spacing w:before="80"/>
+        <w:spacing w:after="0" w:before="0" w:line="140" w:lineRule="exact"/>
       </w:pPr>
-      <w:r>
-        <w:rPr>
-          <w:rFonts w:ascii="Calibri" w:hAnsi="Calibri"/>
-          <w:b/>
-          <w:i w:val="0"/>
-          <w:sz w:val="21"/>
-        </w:rPr>
-        <w:t xml:space="preserve">Ellen Vermaas  —  </w:t>
-      </w:r>
-      <w:r>
-        <w:rPr>
-          <w:rFonts w:ascii="Calibri" w:hAnsi="Calibri"/>
-          <w:b w:val="0"/>
-          <w:i/>
-          <w:sz w:val="21"/>
-        </w:rPr>
-        <w:t>Team Lead, Sizwe IT Group</w:t>
-      </w:r>
-      <w:r>
-        <w:rPr>
-          <w:rFonts w:ascii="Calibri" w:hAnsi="Calibri"/>
-          <w:b w:val="0"/>
-          <w:i w:val="0"/>
-          <w:sz w:val="21"/>
-        </w:rPr>
-        <w:tab/>
-        <w:t>012 657 5300</w:t>
-      </w:r>
     </w:p>
+    <w:tbl>
+      <w:tblPr>
+        <w:tblW w:type="auto" w:w="0"/>
+        <w:jc w:val="left"/>
+        <w:tblLook w:firstColumn="1" w:firstRow="1" w:lastColumn="0" w:lastRow="0" w:noHBand="0" w:noVBand="1" w:val="04A0"/>
+        <w:tblBorders>
+          <w:top w:val="none" w:sz="0" w:space="0"/>
+          <w:left w:val="none" w:sz="0" w:space="0"/>
+          <w:bottom w:val="none" w:sz="0" w:space="0"/>
+          <w:right w:val="none" w:sz="0" w:space="0"/>
+          <w:insideH w:val="none" w:sz="0" w:space="0"/>
+          <w:insideV w:val="none" w:sz="0" w:space="0"/>
+        </w:tblBorders>
+        <w:tblLayout w:type="fixed"/>
+      </w:tblPr>
+      <w:tblGrid>
+        <w:gridCol w:w="5256"/>
+        <w:gridCol w:w="5256"/>
+      </w:tblGrid>
+      <w:tr>
+        <w:tc>
+          <w:tcPr>
+            <w:tcW w:type="dxa" w:w="1800"/>
+            <w:tcMar>
+              <w:top w:w="0" w:type="dxa"/>
+              <w:left w:w="0" w:type="dxa"/>
+              <w:bottom w:w="0" w:type="dxa"/>
+              <w:right w:w="120" w:type="dxa"/>
+            </w:tcMar>
+            <w:vAlign w:val="top"/>
+          </w:tcPr>
+          <w:p>
+            <w:pPr>
+              <w:spacing w:before="20"/>
+            </w:pPr>
+            <w:r>
+              <w:rPr>
+                <w:rFonts w:ascii="Calibri" w:hAnsi="Calibri"/>
+                <w:b w:val="0"/>
+                <w:i w:val="0"/>
+                <w:color w:val="555555"/>
+                <w:sz w:val="19"/>
+              </w:rPr>
+              <w:t>012 657 5300</w:t>
+            </w:r>
+          </w:p>
+        </w:tc>
+        <w:tc>
+          <w:tcPr>
+            <w:tcW w:type="dxa" w:w="8712"/>
+            <w:tcMar>
+              <w:top w:w="0" w:type="dxa"/>
+              <w:left w:w="0" w:type="dxa"/>
+              <w:bottom w:w="0" w:type="dxa"/>
+              <w:right w:w="0" w:type="dxa"/>
+            </w:tcMar>
+            <w:vAlign w:val="top"/>
+          </w:tcPr>
+          <w:p>
+            <w:pPr>
+              <w:spacing w:after="0"/>
+            </w:pPr>
+            <w:r>
+              <w:rPr>
+                <w:rFonts w:ascii="Calibri" w:hAnsi="Calibri"/>
+                <w:b/>
+                <w:i w:val="0"/>
+                <w:sz w:val="21"/>
+              </w:rPr>
+              <w:t xml:space="preserve">Ellen Vermaas  —  </w:t>
+            </w:r>
+            <w:r>
+              <w:rPr>
+                <w:rFonts w:ascii="Calibri" w:hAnsi="Calibri"/>
+                <w:b w:val="0"/>
+                <w:i/>
+                <w:sz w:val="21"/>
+              </w:rPr>
+              <w:t>Team Lead, Sizwe IT Group</w:t>
+            </w:r>
+          </w:p>
+        </w:tc>
+      </w:tr>
+    </w:tbl>
     <w:p>
       <w:pPr>
-        <w:tabs>
-          <w:tab w:pos="10512" w:val="right"/>
-        </w:tabs>
-        <w:spacing w:before="80"/>
+        <w:spacing w:after="0" w:before="0" w:line="140" w:lineRule="exact"/>
       </w:pPr>
-      <w:r>
-        <w:rPr>
-          <w:rFonts w:ascii="Calibri" w:hAnsi="Calibri"/>
-          <w:b/>
-          <w:i w:val="0"/>
-          <w:sz w:val="21"/>
-        </w:rPr>
-        <w:t xml:space="preserve">Thembi Vilakazi  —  </w:t>
-      </w:r>
-      <w:r>
-        <w:rPr>
-          <w:rFonts w:ascii="Calibri" w:hAnsi="Calibri"/>
-          <w:b w:val="0"/>
-          <w:i/>
-          <w:sz w:val="21"/>
-        </w:rPr>
-        <w:t>Manager, Bytes Managed Solutions</w:t>
-      </w:r>
-      <w:r>
-        <w:rPr>
-          <w:rFonts w:ascii="Calibri" w:hAnsi="Calibri"/>
-          <w:b w:val="0"/>
-          <w:i w:val="0"/>
-          <w:sz w:val="21"/>
-        </w:rPr>
-        <w:tab/>
-        <w:t>011 373 4603</w:t>
-      </w:r>
     </w:p>
+    <w:tbl>
+      <w:tblPr>
+        <w:tblW w:type="auto" w:w="0"/>
+        <w:jc w:val="left"/>
+        <w:tblLook w:firstColumn="1" w:firstRow="1" w:lastColumn="0" w:lastRow="0" w:noHBand="0" w:noVBand="1" w:val="04A0"/>
+        <w:tblBorders>
+          <w:top w:val="none" w:sz="0" w:space="0"/>
+          <w:left w:val="none" w:sz="0" w:space="0"/>
+          <w:bottom w:val="none" w:sz="0" w:space="0"/>
+          <w:right w:val="none" w:sz="0" w:space="0"/>
+          <w:insideH w:val="none" w:sz="0" w:space="0"/>
+          <w:insideV w:val="none" w:sz="0" w:space="0"/>
+        </w:tblBorders>
+        <w:tblLayout w:type="fixed"/>
+      </w:tblPr>
+      <w:tblGrid>
+        <w:gridCol w:w="5256"/>
+        <w:gridCol w:w="5256"/>
+      </w:tblGrid>
+      <w:tr>
+        <w:tc>
+          <w:tcPr>
+            <w:tcW w:type="dxa" w:w="1800"/>
+            <w:tcMar>
+              <w:top w:w="0" w:type="dxa"/>
+              <w:left w:w="0" w:type="dxa"/>
+              <w:bottom w:w="0" w:type="dxa"/>
+              <w:right w:w="120" w:type="dxa"/>
+            </w:tcMar>
+            <w:vAlign w:val="top"/>
+          </w:tcPr>
+          <w:p>
+            <w:pPr>
+              <w:spacing w:before="20"/>
+            </w:pPr>
+            <w:r>
+              <w:rPr>
+                <w:rFonts w:ascii="Calibri" w:hAnsi="Calibri"/>
+                <w:b w:val="0"/>
+                <w:i w:val="0"/>
+                <w:color w:val="555555"/>
+                <w:sz w:val="19"/>
+              </w:rPr>
+              <w:t>011 373 4603</w:t>
+            </w:r>
+          </w:p>
+        </w:tc>
+        <w:tc>
+          <w:tcPr>
+            <w:tcW w:type="dxa" w:w="8712"/>
+            <w:tcMar>
+              <w:top w:w="0" w:type="dxa"/>
+              <w:left w:w="0" w:type="dxa"/>
+              <w:bottom w:w="0" w:type="dxa"/>
+              <w:right w:w="0" w:type="dxa"/>
+            </w:tcMar>
+            <w:vAlign w:val="top"/>
+          </w:tcPr>
+          <w:p>
+            <w:pPr>
+              <w:spacing w:after="0"/>
+            </w:pPr>
+            <w:r>
+              <w:rPr>
+                <w:rFonts w:ascii="Calibri" w:hAnsi="Calibri"/>
+                <w:b/>
+                <w:i w:val="0"/>
+                <w:sz w:val="21"/>
+              </w:rPr>
+              <w:t xml:space="preserve">Thembi Vilakazi  —  </w:t>
+            </w:r>
+            <w:r>
+              <w:rPr>
+                <w:rFonts w:ascii="Calibri" w:hAnsi="Calibri"/>
+                <w:b w:val="0"/>
+                <w:i/>
+                <w:sz w:val="21"/>
+              </w:rPr>
+              <w:t>Manager, Bytes Managed Solutions</w:t>
+            </w:r>
+          </w:p>
+        </w:tc>
+      </w:tr>
+    </w:tbl>
     <w:p>
       <w:pPr>
-        <w:tabs>
-          <w:tab w:pos="10512" w:val="right"/>
-        </w:tabs>
-        <w:spacing w:before="80"/>
+        <w:spacing w:after="0" w:before="0" w:line="140" w:lineRule="exact"/>
       </w:pPr>
-      <w:r>
-        <w:rPr>
-          <w:rFonts w:ascii="Calibri" w:hAnsi="Calibri"/>
-          <w:b/>
-          <w:i w:val="0"/>
-          <w:sz w:val="21"/>
-        </w:rPr>
-        <w:t xml:space="preserve">Phuti Mokwele  —  </w:t>
-      </w:r>
-      <w:r>
-        <w:rPr>
-          <w:rFonts w:ascii="Calibri" w:hAnsi="Calibri"/>
-          <w:b w:val="0"/>
-          <w:i/>
-          <w:sz w:val="21"/>
-        </w:rPr>
-        <w:t>Team Lead, Gijima Technologies</w:t>
-      </w:r>
-      <w:r>
-        <w:rPr>
-          <w:rFonts w:ascii="Calibri" w:hAnsi="Calibri"/>
-          <w:b w:val="0"/>
-          <w:i w:val="0"/>
-          <w:sz w:val="21"/>
-        </w:rPr>
-        <w:tab/>
-        <w:t>015 285 0026</w:t>
-      </w:r>
     </w:p>
+    <w:tbl>
+      <w:tblPr>
+        <w:tblW w:type="auto" w:w="0"/>
+        <w:jc w:val="left"/>
+        <w:tblLook w:firstColumn="1" w:firstRow="1" w:lastColumn="0" w:lastRow="0" w:noHBand="0" w:noVBand="1" w:val="04A0"/>
+        <w:tblBorders>
+          <w:top w:val="none" w:sz="0" w:space="0"/>
+          <w:left w:val="none" w:sz="0" w:space="0"/>
+          <w:bottom w:val="none" w:sz="0" w:space="0"/>
+          <w:right w:val="none" w:sz="0" w:space="0"/>
+          <w:insideH w:val="none" w:sz="0" w:space="0"/>
+          <w:insideV w:val="none" w:sz="0" w:space="0"/>
+        </w:tblBorders>
+        <w:tblLayout w:type="fixed"/>
+      </w:tblPr>
+      <w:tblGrid>
+        <w:gridCol w:w="5256"/>
+        <w:gridCol w:w="5256"/>
+      </w:tblGrid>
+      <w:tr>
+        <w:tc>
+          <w:tcPr>
+            <w:tcW w:type="dxa" w:w="1800"/>
+            <w:tcMar>
+              <w:top w:w="0" w:type="dxa"/>
+              <w:left w:w="0" w:type="dxa"/>
+              <w:bottom w:w="0" w:type="dxa"/>
+              <w:right w:w="120" w:type="dxa"/>
+            </w:tcMar>
+            <w:vAlign w:val="top"/>
+          </w:tcPr>
+          <w:p>
+            <w:pPr>
+              <w:spacing w:before="20"/>
+            </w:pPr>
+            <w:r>
+              <w:rPr>
+                <w:rFonts w:ascii="Calibri" w:hAnsi="Calibri"/>
+                <w:b w:val="0"/>
+                <w:i w:val="0"/>
+                <w:color w:val="555555"/>
+                <w:sz w:val="19"/>
+              </w:rPr>
+              <w:t>015 285 0026</w:t>
+            </w:r>
+          </w:p>
+        </w:tc>
+        <w:tc>
+          <w:tcPr>
+            <w:tcW w:type="dxa" w:w="8712"/>
+            <w:tcMar>
+              <w:top w:w="0" w:type="dxa"/>
+              <w:left w:w="0" w:type="dxa"/>
+              <w:bottom w:w="0" w:type="dxa"/>
+              <w:right w:w="0" w:type="dxa"/>
+            </w:tcMar>
+            <w:vAlign w:val="top"/>
+          </w:tcPr>
+          <w:p>
+            <w:pPr>
+              <w:spacing w:after="0"/>
+            </w:pPr>
+            <w:r>
+              <w:rPr>
+                <w:rFonts w:ascii="Calibri" w:hAnsi="Calibri"/>
+                <w:b/>
+                <w:i w:val="0"/>
+                <w:sz w:val="21"/>
+              </w:rPr>
+              <w:t xml:space="preserve">Phuti Mokwele  —  </w:t>
+            </w:r>
+            <w:r>
+              <w:rPr>
+                <w:rFonts w:ascii="Calibri" w:hAnsi="Calibri"/>
+                <w:b w:val="0"/>
+                <w:i/>
+                <w:sz w:val="21"/>
+              </w:rPr>
+              <w:t>Team Lead, Gijima Technologies</w:t>
+            </w:r>
+          </w:p>
+        </w:tc>
+      </w:tr>
+    </w:tbl>
     <w:sectPr>
       <w:pgSz w:w="12240" w:h="15840"/>
       <w:pgMar w:top="720" w:right="864" w:bottom="720" w:left="864" w:header="720" w:footer="720" w:gutter="0"/>

</xml_diff>